<commit_message>
Rewrite CREST report in first-person student voice, fix document formatting
- Rewrite the report in first-person student voice throughout, no
  content changes (nothing in the underlying project changed).
- Switch document template to Times New Roman, remove markdown-export
  styling (heading underlines, section-divider rules, shaded table
  headers); fix table column widths and code-block font size that
  LibreOffice's HTML import had broken.
</commit_message>
<xml_diff>
--- a/optimized/crest/CREST_GOLD_REPORT.docx
+++ b/optimized/crest/CREST_GOLD_REPORT.docx
@@ -6,13 +6,13 @@
       <w:pPr>
         <w:pStyle w:val="Heading1"/>
         <w:bidi w:val="0"/>
-        <w:spacing w:before="240" w:after="283"/>
-        <w:jc w:val="left"/>
-        <w:rPr/>
-      </w:pPr>
-      <w:r>
-        <w:rPr/>
-        <w:t>CANIS: designing a conditioning robot that a frightened dog can live with</w:t>
+        <w:spacing w:before="240" w:after="280"/>
+        <w:jc w:val="left"/>
+        <w:rPr/>
+      </w:pPr>
+      <w:r>
+        <w:rPr/>
+        <w:t>CANIS: building a conditioning robot a frightened dog can actually live with</w:t>
       </w:r>
     </w:p>
     <w:p>
@@ -116,17 +116,17 @@
       </w:r>
       <w:r>
         <w:rPr/>
-        <w:t xml:space="preserve"> This project is submitted as a </w:t>
-      </w:r>
-      <w:r>
-        <w:rPr>
-          <w:rStyle w:val="Strong"/>
-        </w:rPr>
-        <w:t>systems, design and safety engineering</w:t>
-      </w:r>
-      <w:r>
-        <w:rPr/>
-        <w:t xml:space="preserve"> study. It makes </w:t>
+        <w:t xml:space="preserve"> I'm submitting this as a </w:t>
+      </w:r>
+      <w:r>
+        <w:rPr>
+          <w:rStyle w:val="Strong"/>
+        </w:rPr>
+        <w:t>systems, design, and safety engineering</w:t>
+      </w:r>
+      <w:r>
+        <w:rPr/>
+        <w:t xml:space="preserve"> project. I'm making </w:t>
       </w:r>
       <w:r>
         <w:rPr>
@@ -136,7 +136,7 @@
       </w:r>
       <w:r>
         <w:rPr/>
-        <w:t xml:space="preserve"> that the device changes the dog's behaviour, and no behavioural trial was run. That scoping is deliberate and is argued in §12. A behaviour-change claim would require a controlled, multi-subject, ethically-reviewed study, and reporting one without that would be the single worst thing this project could do. Results reported here are engineering-validation results, and they're real, dated, and logged.</w:t>
+        <w:t xml:space="preserve"> that the device actually changes the dog's behaviour, and I didn't run a behavioural trial. That's a deliberate choice, and I explain why in §12: a behaviour-change claim would need a controlled, multi-subject, ethically-reviewed study, and reporting one without that would be the single worst thing I could do here. What I do have are engineering validation results, and they're real, dated, and logged.</w:t>
       </w:r>
     </w:p>
     <w:p>
@@ -159,17 +159,6 @@
     </w:p>
     <w:p>
       <w:pPr>
-        <w:pStyle w:val="HorizontalLine"/>
-        <w:bidi w:val="0"/>
-        <w:jc w:val="left"/>
-        <w:rPr/>
-      </w:pPr>
-      <w:r>
-        <w:rPr/>
-      </w:r>
-    </w:p>
-    <w:p>
-      <w:pPr>
         <w:pStyle w:val="Heading2"/>
         <w:bidi w:val="0"/>
         <w:jc w:val="left"/>
@@ -195,7 +184,7 @@
       </w:r>
       <w:r>
         <w:rPr/>
-        <w:t xml:space="preserve"> to design and build a home robot that helps condition a dog's behaviour through consistent, precisely-timed reward, for a dog who is </w:t>
+        <w:t xml:space="preserve"> design and build a home robot that helps condition a dog's behaviour through consistent, precisely-timed reward, for a dog who's </w:t>
       </w:r>
       <w:r>
         <w:rPr>
@@ -205,25 +194,25 @@
       </w:r>
       <w:r>
         <w:rPr/>
-        <w:t>, which makes the robot itself the problem the design has to solve.</w:t>
-      </w:r>
-    </w:p>
-    <w:p>
-      <w:pPr>
-        <w:pStyle w:val="BodyText"/>
-        <w:bidi w:val="0"/>
-        <w:jc w:val="left"/>
-        <w:rPr/>
-      </w:pPr>
-      <w:r>
-        <w:rPr/>
-        <w:t xml:space="preserve">The subject is a young Goldendoodle who shows several target behaviours (eating things he shouldn't, barking, climbing furniture, roaming) and is measurably frightened by movement. Most automated pet devices would make this dog's situation worse, not better. That single fact reframes the whole engineering problem: robot motion isn't a free actuator, it's a </w:t>
-      </w:r>
-      <w:r>
-        <w:rPr>
-          <w:rStyle w:val="Strong"/>
-        </w:rPr>
-        <w:t>hazard to be rationed</w:t>
+        <w:t>, which makes the robot itself the problem the whole design has to solve.</w:t>
+      </w:r>
+    </w:p>
+    <w:p>
+      <w:pPr>
+        <w:pStyle w:val="BodyText"/>
+        <w:bidi w:val="0"/>
+        <w:jc w:val="left"/>
+        <w:rPr/>
+      </w:pPr>
+      <w:r>
+        <w:rPr/>
+        <w:t xml:space="preserve">The subject is a young Goldendoodle who does several things I'd like him not to (eats things he shouldn't, barks, climbs the furniture, roams), and who's also measurably scared of movement. Most automated pet devices would make this dog's situation worse, not better. That one fact reframes the whole engineering problem: robot motion isn't a free actuator here, it's a </w:t>
+      </w:r>
+      <w:r>
+        <w:rPr>
+          <w:rStyle w:val="Strong"/>
+        </w:rPr>
+        <w:t>hazard I have to ration out carefully</w:t>
       </w:r>
       <w:r>
         <w:rPr/>
@@ -239,27 +228,27 @@
       </w:pPr>
       <w:r>
         <w:rPr/>
-        <w:t>Five objectives followed:</w:t>
+        <w:t>Five objectives followed from that:</w:t>
       </w:r>
     </w:p>
     <w:tbl>
       <w:tblPr>
-        <w:tblW w:w="11339" w:type="dxa"/>
         <w:jc w:val="left"/>
         <w:tblInd w:w="28" w:type="dxa"/>
-        <w:tblLayout w:type="fixed"/>
         <w:tblCellMar>
           <w:top w:w="28" w:type="dxa"/>
           <w:left w:w="28" w:type="dxa"/>
           <w:bottom w:w="28" w:type="dxa"/>
           <w:right w:w="28" w:type="dxa"/>
         </w:tblCellMar>
+        <w:tblLayout w:type="fixed"/>
+        <w:tblW w:w="9072" w:type="dxa"/>
       </w:tblPr>
       <w:tblGrid>
-        <w:gridCol w:w="384"/>
-        <w:gridCol w:w="3134"/>
-        <w:gridCol w:w="4457"/>
-        <w:gridCol w:w="3364"/>
+        <w:gridCol w:w="982"/>
+        <w:gridCol w:w="2445"/>
+        <w:gridCol w:w="3778"/>
+        <w:gridCol w:w="1867"/>
       </w:tblGrid>
       <w:tr>
         <w:trPr>
@@ -267,15 +256,14 @@
         </w:trPr>
         <w:tc>
           <w:tcPr>
-            <w:tcW w:w="384" w:type="dxa"/>
-            <w:tcBorders/>
-            <w:vAlign w:val="center"/>
+            <w:tcBorders/>
+            <w:vAlign w:val="center"/>
+            <w:tcW w:w="982" w:type="dxa"/>
           </w:tcPr>
           <w:p>
             <w:pPr>
               <w:pStyle w:val="TableHeading"/>
               <w:suppressLineNumbers/>
-              <w:shd w:fill="EEEEEE" w:val="clear"/>
               <w:bidi w:val="0"/>
               <w:spacing w:before="0" w:after="283"/>
               <w:jc w:val="left"/>
@@ -289,15 +277,14 @@
         </w:tc>
         <w:tc>
           <w:tcPr>
-            <w:tcW w:w="3134" w:type="dxa"/>
-            <w:tcBorders/>
-            <w:vAlign w:val="center"/>
+            <w:tcBorders/>
+            <w:vAlign w:val="center"/>
+            <w:tcW w:w="2445" w:type="dxa"/>
           </w:tcPr>
           <w:p>
             <w:pPr>
               <w:pStyle w:val="TableHeading"/>
               <w:suppressLineNumbers/>
-              <w:shd w:fill="EEEEEE" w:val="clear"/>
               <w:bidi w:val="0"/>
               <w:spacing w:before="0" w:after="283"/>
               <w:jc w:val="left"/>
@@ -311,37 +298,35 @@
         </w:tc>
         <w:tc>
           <w:tcPr>
-            <w:tcW w:w="4457" w:type="dxa"/>
-            <w:tcBorders/>
-            <w:vAlign w:val="center"/>
+            <w:tcBorders/>
+            <w:vAlign w:val="center"/>
+            <w:tcW w:w="3778" w:type="dxa"/>
           </w:tcPr>
           <w:p>
             <w:pPr>
               <w:pStyle w:val="TableHeading"/>
               <w:suppressLineNumbers/>
-              <w:shd w:fill="EEEEEE" w:val="clear"/>
-              <w:bidi w:val="0"/>
-              <w:spacing w:before="0" w:after="283"/>
-              <w:jc w:val="left"/>
-              <w:rPr/>
-            </w:pPr>
-            <w:r>
-              <w:rPr/>
-              <w:t>Success measure</w:t>
-            </w:r>
-          </w:p>
-        </w:tc>
-        <w:tc>
-          <w:tcPr>
-            <w:tcW w:w="3364" w:type="dxa"/>
-            <w:tcBorders/>
-            <w:vAlign w:val="center"/>
+              <w:bidi w:val="0"/>
+              <w:spacing w:before="0" w:after="283"/>
+              <w:jc w:val="left"/>
+              <w:rPr/>
+            </w:pPr>
+            <w:r>
+              <w:rPr/>
+              <w:t>How I'd know</w:t>
+            </w:r>
+          </w:p>
+        </w:tc>
+        <w:tc>
+          <w:tcPr>
+            <w:tcBorders/>
+            <w:vAlign w:val="center"/>
+            <w:tcW w:w="1867" w:type="dxa"/>
           </w:tcPr>
           <w:p>
             <w:pPr>
               <w:pStyle w:val="TableHeading"/>
               <w:suppressLineNumbers/>
-              <w:shd w:fill="EEEEEE" w:val="clear"/>
               <w:bidi w:val="0"/>
               <w:spacing w:before="0" w:after="283"/>
               <w:jc w:val="left"/>
@@ -358,9 +343,9 @@
         <w:trPr/>
         <w:tc>
           <w:tcPr>
-            <w:tcW w:w="384" w:type="dxa"/>
-            <w:tcBorders/>
-            <w:vAlign w:val="center"/>
+            <w:tcBorders/>
+            <w:vAlign w:val="center"/>
+            <w:tcW w:w="982" w:type="dxa"/>
           </w:tcPr>
           <w:p>
             <w:pPr>
@@ -378,29 +363,29 @@
         </w:tc>
         <w:tc>
           <w:tcPr>
-            <w:tcW w:w="3134" w:type="dxa"/>
-            <w:tcBorders/>
-            <w:vAlign w:val="center"/>
-          </w:tcPr>
-          <w:p>
-            <w:pPr>
-              <w:pStyle w:val="TableContents"/>
-              <w:bidi w:val="0"/>
-              <w:spacing w:before="0" w:after="283"/>
-              <w:jc w:val="left"/>
-              <w:rPr/>
-            </w:pPr>
-            <w:r>
-              <w:rPr/>
-              <w:t>Deliver reward on a conditioning-relevant timescale</w:t>
-            </w:r>
-          </w:p>
-        </w:tc>
-        <w:tc>
-          <w:tcPr>
-            <w:tcW w:w="4457" w:type="dxa"/>
-            <w:tcBorders/>
-            <w:vAlign w:val="center"/>
+            <w:tcBorders/>
+            <w:vAlign w:val="center"/>
+            <w:tcW w:w="2445" w:type="dxa"/>
+          </w:tcPr>
+          <w:p>
+            <w:pPr>
+              <w:pStyle w:val="TableContents"/>
+              <w:bidi w:val="0"/>
+              <w:spacing w:before="0" w:after="283"/>
+              <w:jc w:val="left"/>
+              <w:rPr/>
+            </w:pPr>
+            <w:r>
+              <w:rPr/>
+              <w:t>Deliver reward on a timescale that actually matters for conditioning</w:t>
+            </w:r>
+          </w:p>
+        </w:tc>
+        <w:tc>
+          <w:tcPr>
+            <w:tcBorders/>
+            <w:vAlign w:val="center"/>
+            <w:tcW w:w="3778" w:type="dxa"/>
           </w:tcPr>
           <w:p>
             <w:pPr>
@@ -418,9 +403,9 @@
         </w:tc>
         <w:tc>
           <w:tcPr>
-            <w:tcW w:w="3364" w:type="dxa"/>
-            <w:tcBorders/>
-            <w:vAlign w:val="center"/>
+            <w:tcBorders/>
+            <w:vAlign w:val="center"/>
+            <w:tcW w:w="1867" w:type="dxa"/>
           </w:tcPr>
           <w:p>
             <w:pPr>
@@ -447,9 +432,9 @@
         <w:trPr/>
         <w:tc>
           <w:tcPr>
-            <w:tcW w:w="384" w:type="dxa"/>
-            <w:tcBorders/>
-            <w:vAlign w:val="center"/>
+            <w:tcBorders/>
+            <w:vAlign w:val="center"/>
+            <w:tcW w:w="982" w:type="dxa"/>
           </w:tcPr>
           <w:p>
             <w:pPr>
@@ -467,49 +452,49 @@
         </w:tc>
         <w:tc>
           <w:tcPr>
-            <w:tcW w:w="3134" w:type="dxa"/>
-            <w:tcBorders/>
-            <w:vAlign w:val="center"/>
-          </w:tcPr>
-          <w:p>
-            <w:pPr>
-              <w:pStyle w:val="TableContents"/>
-              <w:bidi w:val="0"/>
-              <w:spacing w:before="0" w:after="283"/>
-              <w:jc w:val="left"/>
-              <w:rPr/>
-            </w:pPr>
-            <w:r>
-              <w:rPr/>
-              <w:t>Never punish; reward the desired alternative</w:t>
-            </w:r>
-          </w:p>
-        </w:tc>
-        <w:tc>
-          <w:tcPr>
-            <w:tcW w:w="4457" w:type="dxa"/>
-            <w:tcBorders/>
-            <w:vAlign w:val="center"/>
-          </w:tcPr>
-          <w:p>
-            <w:pPr>
-              <w:pStyle w:val="TableContents"/>
-              <w:bidi w:val="0"/>
-              <w:spacing w:before="0" w:after="283"/>
-              <w:jc w:val="left"/>
-              <w:rPr/>
-            </w:pPr>
-            <w:r>
-              <w:rPr/>
-              <w:t>No punishment path exists in the state machine at all</w:t>
-            </w:r>
-          </w:p>
-        </w:tc>
-        <w:tc>
-          <w:tcPr>
-            <w:tcW w:w="3364" w:type="dxa"/>
-            <w:tcBorders/>
-            <w:vAlign w:val="center"/>
+            <w:tcBorders/>
+            <w:vAlign w:val="center"/>
+            <w:tcW w:w="2445" w:type="dxa"/>
+          </w:tcPr>
+          <w:p>
+            <w:pPr>
+              <w:pStyle w:val="TableContents"/>
+              <w:bidi w:val="0"/>
+              <w:spacing w:before="0" w:after="283"/>
+              <w:jc w:val="left"/>
+              <w:rPr/>
+            </w:pPr>
+            <w:r>
+              <w:rPr/>
+              <w:t>Never punish, only reward the alternative</w:t>
+            </w:r>
+          </w:p>
+        </w:tc>
+        <w:tc>
+          <w:tcPr>
+            <w:tcBorders/>
+            <w:vAlign w:val="center"/>
+            <w:tcW w:w="3778" w:type="dxa"/>
+          </w:tcPr>
+          <w:p>
+            <w:pPr>
+              <w:pStyle w:val="TableContents"/>
+              <w:bidi w:val="0"/>
+              <w:spacing w:before="0" w:after="283"/>
+              <w:jc w:val="left"/>
+              <w:rPr/>
+            </w:pPr>
+            <w:r>
+              <w:rPr/>
+              <w:t>No punishment path exists anywhere in the state machine</w:t>
+            </w:r>
+          </w:p>
+        </w:tc>
+        <w:tc>
+          <w:tcPr>
+            <w:tcBorders/>
+            <w:vAlign w:val="center"/>
+            <w:tcW w:w="1867" w:type="dxa"/>
           </w:tcPr>
           <w:p>
             <w:pPr>
@@ -536,9 +521,9 @@
         <w:trPr/>
         <w:tc>
           <w:tcPr>
-            <w:tcW w:w="384" w:type="dxa"/>
-            <w:tcBorders/>
-            <w:vAlign w:val="center"/>
+            <w:tcBorders/>
+            <w:vAlign w:val="center"/>
+            <w:tcW w:w="982" w:type="dxa"/>
           </w:tcPr>
           <w:p>
             <w:pPr>
@@ -556,49 +541,49 @@
         </w:tc>
         <w:tc>
           <w:tcPr>
-            <w:tcW w:w="3134" w:type="dxa"/>
-            <w:tcBorders/>
-            <w:vAlign w:val="center"/>
-          </w:tcPr>
-          <w:p>
-            <w:pPr>
-              <w:pStyle w:val="TableContents"/>
-              <w:bidi w:val="0"/>
-              <w:spacing w:before="0" w:after="283"/>
-              <w:jc w:val="left"/>
-              <w:rPr/>
-            </w:pPr>
-            <w:r>
-              <w:rPr/>
-              <w:t>Make robot motion safe by architecture, not by care</w:t>
-            </w:r>
-          </w:p>
-        </w:tc>
-        <w:tc>
-          <w:tcPr>
-            <w:tcW w:w="4457" w:type="dxa"/>
-            <w:tcBorders/>
-            <w:vAlign w:val="center"/>
-          </w:tcPr>
-          <w:p>
-            <w:pPr>
-              <w:pStyle w:val="TableContents"/>
-              <w:bidi w:val="0"/>
-              <w:spacing w:before="0" w:after="283"/>
-              <w:jc w:val="left"/>
-              <w:rPr/>
-            </w:pPr>
-            <w:r>
-              <w:rPr/>
-              <w:t>The robot halts within ~1 s of losing its command link, in every failure mode</w:t>
-            </w:r>
-          </w:p>
-        </w:tc>
-        <w:tc>
-          <w:tcPr>
-            <w:tcW w:w="3364" w:type="dxa"/>
-            <w:tcBorders/>
-            <w:vAlign w:val="center"/>
+            <w:tcBorders/>
+            <w:vAlign w:val="center"/>
+            <w:tcW w:w="2445" w:type="dxa"/>
+          </w:tcPr>
+          <w:p>
+            <w:pPr>
+              <w:pStyle w:val="TableContents"/>
+              <w:bidi w:val="0"/>
+              <w:spacing w:before="0" w:after="283"/>
+              <w:jc w:val="left"/>
+              <w:rPr/>
+            </w:pPr>
+            <w:r>
+              <w:rPr/>
+              <w:t>Make robot motion safe by design, not by carefulness</w:t>
+            </w:r>
+          </w:p>
+        </w:tc>
+        <w:tc>
+          <w:tcPr>
+            <w:tcBorders/>
+            <w:vAlign w:val="center"/>
+            <w:tcW w:w="3778" w:type="dxa"/>
+          </w:tcPr>
+          <w:p>
+            <w:pPr>
+              <w:pStyle w:val="TableContents"/>
+              <w:bidi w:val="0"/>
+              <w:spacing w:before="0" w:after="283"/>
+              <w:jc w:val="left"/>
+              <w:rPr/>
+            </w:pPr>
+            <w:r>
+              <w:rPr/>
+              <w:t>The robot halts within ~1 s of losing its command link, in every failure mode I tested</w:t>
+            </w:r>
+          </w:p>
+        </w:tc>
+        <w:tc>
+          <w:tcPr>
+            <w:tcBorders/>
+            <w:vAlign w:val="center"/>
+            <w:tcW w:w="1867" w:type="dxa"/>
           </w:tcPr>
           <w:p>
             <w:pPr>
@@ -625,9 +610,9 @@
         <w:trPr/>
         <w:tc>
           <w:tcPr>
-            <w:tcW w:w="384" w:type="dxa"/>
-            <w:tcBorders/>
-            <w:vAlign w:val="center"/>
+            <w:tcBorders/>
+            <w:vAlign w:val="center"/>
+            <w:tcW w:w="982" w:type="dxa"/>
           </w:tcPr>
           <w:p>
             <w:pPr>
@@ -645,49 +630,49 @@
         </w:tc>
         <w:tc>
           <w:tcPr>
-            <w:tcW w:w="3134" w:type="dxa"/>
-            <w:tcBorders/>
-            <w:vAlign w:val="center"/>
-          </w:tcPr>
-          <w:p>
-            <w:pPr>
-              <w:pStyle w:val="TableContents"/>
-              <w:bidi w:val="0"/>
-              <w:spacing w:before="0" w:after="283"/>
-              <w:jc w:val="left"/>
-              <w:rPr/>
-            </w:pPr>
-            <w:r>
-              <w:rPr/>
-              <w:t>Make welfare a controllable, default-safe quantity</w:t>
-            </w:r>
-          </w:p>
-        </w:tc>
-        <w:tc>
-          <w:tcPr>
-            <w:tcW w:w="4457" w:type="dxa"/>
-            <w:tcBorders/>
-            <w:vAlign w:val="center"/>
-          </w:tcPr>
-          <w:p>
-            <w:pPr>
-              <w:pStyle w:val="TableContents"/>
-              <w:bidi w:val="0"/>
-              <w:spacing w:before="0" w:after="283"/>
-              <w:jc w:val="left"/>
-              <w:rPr/>
-            </w:pPr>
-            <w:r>
-              <w:rPr/>
-              <w:t>A single explicit exposure level, defaulting to no motion, reversible, with the system still useful at that default</w:t>
-            </w:r>
-          </w:p>
-        </w:tc>
-        <w:tc>
-          <w:tcPr>
-            <w:tcW w:w="3364" w:type="dxa"/>
-            <w:tcBorders/>
-            <w:vAlign w:val="center"/>
+            <w:tcBorders/>
+            <w:vAlign w:val="center"/>
+            <w:tcW w:w="2445" w:type="dxa"/>
+          </w:tcPr>
+          <w:p>
+            <w:pPr>
+              <w:pStyle w:val="TableContents"/>
+              <w:bidi w:val="0"/>
+              <w:spacing w:before="0" w:after="283"/>
+              <w:jc w:val="left"/>
+              <w:rPr/>
+            </w:pPr>
+            <w:r>
+              <w:rPr/>
+              <w:t>Make welfare a controllable, default-safe setting</w:t>
+            </w:r>
+          </w:p>
+        </w:tc>
+        <w:tc>
+          <w:tcPr>
+            <w:tcBorders/>
+            <w:vAlign w:val="center"/>
+            <w:tcW w:w="3778" w:type="dxa"/>
+          </w:tcPr>
+          <w:p>
+            <w:pPr>
+              <w:pStyle w:val="TableContents"/>
+              <w:bidi w:val="0"/>
+              <w:spacing w:before="0" w:after="283"/>
+              <w:jc w:val="left"/>
+              <w:rPr/>
+            </w:pPr>
+            <w:r>
+              <w:rPr/>
+              <w:t>A single explicit exposure level, defaulting to no motion, reversible, still useful at that default</w:t>
+            </w:r>
+          </w:p>
+        </w:tc>
+        <w:tc>
+          <w:tcPr>
+            <w:tcBorders/>
+            <w:vAlign w:val="center"/>
+            <w:tcW w:w="1867" w:type="dxa"/>
           </w:tcPr>
           <w:p>
             <w:pPr>
@@ -724,9 +709,9 @@
         <w:trPr/>
         <w:tc>
           <w:tcPr>
-            <w:tcW w:w="384" w:type="dxa"/>
-            <w:tcBorders/>
-            <w:vAlign w:val="center"/>
+            <w:tcBorders/>
+            <w:vAlign w:val="center"/>
+            <w:tcW w:w="982" w:type="dxa"/>
           </w:tcPr>
           <w:p>
             <w:pPr>
@@ -744,49 +729,49 @@
         </w:tc>
         <w:tc>
           <w:tcPr>
-            <w:tcW w:w="3134" w:type="dxa"/>
-            <w:tcBorders/>
-            <w:vAlign w:val="center"/>
-          </w:tcPr>
-          <w:p>
-            <w:pPr>
-              <w:pStyle w:val="TableContents"/>
-              <w:bidi w:val="0"/>
-              <w:spacing w:before="0" w:after="283"/>
-              <w:jc w:val="left"/>
-              <w:rPr/>
-            </w:pPr>
-            <w:r>
-              <w:rPr/>
-              <w:t>Identify the dog reliably enough that a false reward is rare</w:t>
-            </w:r>
-          </w:p>
-        </w:tc>
-        <w:tc>
-          <w:tcPr>
-            <w:tcW w:w="4457" w:type="dxa"/>
-            <w:tcBorders/>
-            <w:vAlign w:val="center"/>
-          </w:tcPr>
-          <w:p>
-            <w:pPr>
-              <w:pStyle w:val="TableContents"/>
-              <w:bidi w:val="0"/>
-              <w:spacing w:before="0" w:after="283"/>
-              <w:jc w:val="left"/>
-              <w:rPr/>
-            </w:pPr>
-            <w:r>
-              <w:rPr/>
-              <w:t>Near-deterministic identification, no false triggering on other people or pets</w:t>
-            </w:r>
-          </w:p>
-        </w:tc>
-        <w:tc>
-          <w:tcPr>
-            <w:tcW w:w="3364" w:type="dxa"/>
-            <w:tcBorders/>
-            <w:vAlign w:val="center"/>
+            <w:tcBorders/>
+            <w:vAlign w:val="center"/>
+            <w:tcW w:w="2445" w:type="dxa"/>
+          </w:tcPr>
+          <w:p>
+            <w:pPr>
+              <w:pStyle w:val="TableContents"/>
+              <w:bidi w:val="0"/>
+              <w:spacing w:before="0" w:after="283"/>
+              <w:jc w:val="left"/>
+              <w:rPr/>
+            </w:pPr>
+            <w:r>
+              <w:rPr/>
+              <w:t>Identify the dog reliably enough that false rewards are rare</w:t>
+            </w:r>
+          </w:p>
+        </w:tc>
+        <w:tc>
+          <w:tcPr>
+            <w:tcBorders/>
+            <w:vAlign w:val="center"/>
+            <w:tcW w:w="3778" w:type="dxa"/>
+          </w:tcPr>
+          <w:p>
+            <w:pPr>
+              <w:pStyle w:val="TableContents"/>
+              <w:bidi w:val="0"/>
+              <w:spacing w:before="0" w:after="283"/>
+              <w:jc w:val="left"/>
+              <w:rPr/>
+            </w:pPr>
+            <w:r>
+              <w:rPr/>
+              <w:t>Near-deterministic identification, no false triggers on other people or pets</w:t>
+            </w:r>
+          </w:p>
+        </w:tc>
+        <w:tc>
+          <w:tcPr>
+            <w:tcBorders/>
+            <w:vAlign w:val="center"/>
+            <w:tcW w:w="1867" w:type="dxa"/>
           </w:tcPr>
           <w:p>
             <w:pPr>
@@ -819,28 +804,17 @@
       </w:pPr>
       <w:r>
         <w:rPr/>
-        <w:t xml:space="preserve">A sixth objective, running the gradual-exposure protocol to the point of logged behavioural observations, was </w:t>
-      </w:r>
-      <w:r>
-        <w:rPr>
-          <w:rStyle w:val="Strong"/>
-        </w:rPr>
-        <w:t>not met</w:t>
-      </w:r>
-      <w:r>
-        <w:rPr/>
-        <w:t>, and §11 says why plainly.</w:t>
-      </w:r>
-    </w:p>
-    <w:p>
-      <w:pPr>
-        <w:pStyle w:val="HorizontalLine"/>
-        <w:bidi w:val="0"/>
-        <w:jc w:val="left"/>
-        <w:rPr/>
-      </w:pPr>
-      <w:r>
-        <w:rPr/>
+        <w:t xml:space="preserve">A sixth objective, actually running the gradual-exposure protocol to the point of logged behavioural observations, </w:t>
+      </w:r>
+      <w:r>
+        <w:rPr>
+          <w:rStyle w:val="Strong"/>
+        </w:rPr>
+        <w:t>wasn't met</w:t>
+      </w:r>
+      <w:r>
+        <w:rPr/>
+        <w:t>, and I explain why honestly in §11.</w:t>
       </w:r>
     </w:p>
     <w:p>
@@ -864,19 +838,19 @@
       </w:pPr>
       <w:r>
         <w:rPr/>
-        <w:t>Companion-animal behaviour problems are common, and the reason most owners fail to resolve them isn't indifference but timing: effective conditioning needs consistent reinforcement delivered within a second or two of the behaviour, every time, and humans just aren't reliable at that. An always-present device is genuinely attractive here.</w:t>
-      </w:r>
-    </w:p>
-    <w:p>
-      <w:pPr>
-        <w:pStyle w:val="BodyText"/>
-        <w:bidi w:val="0"/>
-        <w:jc w:val="left"/>
-        <w:rPr/>
-      </w:pPr>
-      <w:r>
-        <w:rPr/>
-        <w:t xml:space="preserve">The dominant risk is equally real. An automated "corrector" easily becomes an aversive, frightening presence, and for an animal already sensitive to movement, a machine that approaches when it disapproves is close to the worst possible intervention. The wider purpose of this project is to show that the two can be separated: that you can build a device which conditions behaviour </w:t>
+        <w:t>Companion-animal behaviour problems are really common, and the reason most owners can't fix them isn't that they don't care, it's timing: proper conditioning needs consistent reinforcement within a second or two of the behaviour, every single time, and people just aren't that reliable. A device that's always there and always paying attention is genuinely appealing here.</w:t>
+      </w:r>
+    </w:p>
+    <w:p>
+      <w:pPr>
+        <w:pStyle w:val="BodyText"/>
+        <w:bidi w:val="0"/>
+        <w:jc w:val="left"/>
+        <w:rPr/>
+      </w:pPr>
+      <w:r>
+        <w:rPr/>
+        <w:t xml:space="preserve">The obvious risk is just as real, though. An automated "corrector" easily turns into something aversive and frightening, and for an animal that's already sensitive to movement, a machine that approaches whenever it disapproves is about the worst intervention you could design. The wider point of this project is showing those two things can actually be separated: you can build a device that conditions behaviour </w:t>
       </w:r>
       <w:r>
         <w:rPr>
@@ -886,30 +860,19 @@
       </w:r>
       <w:r>
         <w:rPr/>
-        <w:t xml:space="preserve"> the device becoming something the animal fears.</w:t>
-      </w:r>
-    </w:p>
-    <w:p>
-      <w:pPr>
-        <w:pStyle w:val="BodyText"/>
-        <w:bidi w:val="0"/>
-        <w:jc w:val="left"/>
-        <w:rPr/>
-      </w:pPr>
-      <w:r>
-        <w:rPr/>
-        <w:t>The generalisable claim is about where welfare lives in a system. In most designs welfare is diffuse, a collection of good intentions spread across the code, each of which can be individually eroded by a later change. CANIS concentrates it into one explicit, default-safe control (§8.5). That's a transferable pattern for any system acting physically on a living thing, and it's the part of this work that would matter to someone building something else.</w:t>
-      </w:r>
-    </w:p>
-    <w:p>
-      <w:pPr>
-        <w:pStyle w:val="HorizontalLine"/>
-        <w:bidi w:val="0"/>
-        <w:jc w:val="left"/>
-        <w:rPr/>
-      </w:pPr>
-      <w:r>
-        <w:rPr/>
+        <w:t xml:space="preserve"> becoming something the animal is scared of.</w:t>
+      </w:r>
+    </w:p>
+    <w:p>
+      <w:pPr>
+        <w:pStyle w:val="BodyText"/>
+        <w:bidi w:val="0"/>
+        <w:jc w:val="left"/>
+        <w:rPr/>
+      </w:pPr>
+      <w:r>
+        <w:rPr/>
+        <w:t>The bigger, more general idea here is about where welfare actually lives in a system. In most designs it's spread thin, a bunch of good intentions scattered across the code, and any one of those can get quietly eroded by a later change without anyone noticing. CANIS concentrates it into one explicit, default-safe control instead (§8.5). I think that's a pattern that transfers to any system that acts physically on a living thing, and it's probably the part of this project that matters most to someone building something completely different.</w:t>
       </w:r>
     </w:p>
     <w:p>
@@ -921,25 +884,25 @@
       </w:pPr>
       <w:r>
         <w:rPr/>
-        <w:t>3. Approaches considered</w:t>
-      </w:r>
-    </w:p>
-    <w:p>
-      <w:pPr>
-        <w:pStyle w:val="BodyText"/>
-        <w:bidi w:val="0"/>
-        <w:jc w:val="left"/>
-        <w:rPr/>
-      </w:pPr>
-      <w:r>
-        <w:rPr>
-          <w:rStyle w:val="Strong"/>
-        </w:rPr>
-        <w:t>Punish entry, rejected on welfare grounds.</w:t>
-      </w:r>
-      <w:r>
-        <w:rPr/>
-        <w:t xml:space="preserve"> The obvious design, detect the dog in a forbidden zone and deter it, is the standard approach and was rejected before any code was written. For a fearful dog, punishing zone entry pairs the zone </w:t>
+        <w:t>3. Approaches I considered</w:t>
+      </w:r>
+    </w:p>
+    <w:p>
+      <w:pPr>
+        <w:pStyle w:val="BodyText"/>
+        <w:bidi w:val="0"/>
+        <w:jc w:val="left"/>
+        <w:rPr/>
+      </w:pPr>
+      <w:r>
+        <w:rPr>
+          <w:rStyle w:val="Strong"/>
+        </w:rPr>
+        <w:t>Punishing entry, rejected on welfare grounds.</w:t>
+      </w:r>
+      <w:r>
+        <w:rPr/>
+        <w:t xml:space="preserve"> The obvious design here, detect the dog in a zone he's not allowed in and deter him, is the standard approach, and I rejected it before writing any code at all. For a fearful dog, punishing zone entry pairs the zone </w:t>
       </w:r>
       <w:r>
         <w:rPr>
@@ -949,7 +912,7 @@
       </w:r>
       <w:r>
         <w:rPr/>
-        <w:t xml:space="preserve"> with fear, producing an animal who's frightened of a machine that lives in his house. The alternative adopted is to </w:t>
+        <w:t xml:space="preserve"> with fear, which just gives you a dog who's now scared of a machine that lives in his house. What I went with instead is to </w:t>
       </w:r>
       <w:r>
         <w:rPr>
@@ -959,7 +922,7 @@
       </w:r>
       <w:r>
         <w:rPr/>
-        <w:t>: the desired alternative behaviour is reinforced, and disengagement is what earns the treat. Because the reward is contingent on the act of leaving, the system has no punishment path to be misconfigured into.</w:t>
+        <w:t>: the behaviour I actually want gets reinforced, and disengaging is what earns the treat. Because the reward only ever fires on leaving, there's no punishment path in the system at all to accidentally misconfigure.</w:t>
       </w:r>
     </w:p>
     <w:p>
@@ -977,7 +940,7 @@
       </w:r>
       <w:r>
         <w:rPr/>
-        <w:t xml:space="preserve"> The instinct for "find the dog" is a CNN. Fiducial markers, an ArUco </w:t>
+        <w:t xml:space="preserve"> The instinctive choice for "find the dog" is a CNN. I went with fiducial markers instead, an ArUco </w:t>
       </w:r>
       <w:r>
         <w:rPr>
@@ -987,13 +950,13 @@
       </w:r>
       <w:r>
         <w:rPr/>
-        <w:t xml:space="preserve"> tag on the collar, were chosen instead, for three reasons argued in paper §3.6. The task isn't "find any dog in any pose" but "is </w:t>
+        <w:t xml:space="preserve"> tag on the collar, for three reasons I argue in paper §3.6. The task here isn't "find any dog in any pose," it's "is </w:t>
       </w:r>
       <w:r>
         <w:rPr>
           <w:rStyle w:val="Emphasis"/>
         </w:rPr>
-        <w:t>this</w:t>
+        <w:t>this specific</w:t>
       </w:r>
       <w:r>
         <w:rPr/>
@@ -1003,21 +966,21 @@
         <w:rPr>
           <w:rStyle w:val="Emphasis"/>
         </w:rPr>
-        <w:t>this</w:t>
-      </w:r>
-      <w:r>
-        <w:rPr/>
-        <w:t xml:space="preserve"> room," and a fiducial gives a near-deterministic, low-false-positive answer. That matters more than usual here, because </w:t>
-      </w:r>
-      <w:r>
-        <w:rPr>
-          <w:rStyle w:val="Strong"/>
-        </w:rPr>
-        <w:t>a false correction is actively harmful to a fearful animal</w:t>
-      </w:r>
-      <w:r>
-        <w:rPr/>
-        <w:t xml:space="preserve">. The cost of a false positive is asymmetric in a way that ordinary detection benchmarks don't capture. A CNN would also consume far more of the Pi's compute budget for no reliability gain on a single, cooperative, marker-wearing subject. And the marker </w:t>
+        <w:t>this specific</w:t>
+      </w:r>
+      <w:r>
+        <w:rPr/>
+        <w:t xml:space="preserve"> room," and a fiducial gives a near-deterministic, low-false-positive answer to that. That matters more here than it normally would, because </w:t>
+      </w:r>
+      <w:r>
+        <w:rPr>
+          <w:rStyle w:val="Strong"/>
+        </w:rPr>
+        <w:t>a false correction is actually harmful to a fearful animal</w:t>
+      </w:r>
+      <w:r>
+        <w:rPr/>
+        <w:t xml:space="preserve">, so the cost of getting it wrong is lopsided in a way normal detection benchmarks don't account for. A CNN would also eat up way more of the Pi's compute for no real reliability gain, given there's only ever one cooperative, marker-wearing subject. And the marker basically </w:t>
       </w:r>
       <w:r>
         <w:rPr>
@@ -1027,66 +990,55 @@
       </w:r>
       <w:r>
         <w:rPr/>
-        <w:t xml:space="preserve"> identity, so other people or pets in frame trigger nothing.</w:t>
-      </w:r>
-    </w:p>
-    <w:p>
-      <w:pPr>
-        <w:pStyle w:val="BodyText"/>
-        <w:bidi w:val="0"/>
-        <w:jc w:val="left"/>
-        <w:rPr/>
-      </w:pPr>
-      <w:r>
-        <w:rPr/>
-        <w:t>This is framed as a pragmatism result, not a general claim that fiducials beat learned detectors. For a reliability-critical, single-subject, compute-constrained home deployment, the fiducial is the correct engineering choice; change any of those three conditions and the answer changes.</w:t>
-      </w:r>
-    </w:p>
-    <w:p>
-      <w:pPr>
-        <w:pStyle w:val="BodyText"/>
-        <w:bidi w:val="0"/>
-        <w:jc w:val="left"/>
-        <w:rPr/>
-      </w:pPr>
-      <w:r>
-        <w:rPr>
-          <w:rStyle w:val="Strong"/>
-        </w:rPr>
-        <w:t>A single controller, rejected on failure isolation.</w:t>
-      </w:r>
-      <w:r>
-        <w:rPr/>
-        <w:t xml:space="preserve"> Running everything on one board is simpler. It was rejected because it couples failure domains that need to stay separate: vision stalls would delay motor commands, and a crash would take the safety watchdog down with the thing it's watching. The three-tier split (§8.2) exists so the real-time executor can't be starved by a network stall.</w:t>
-      </w:r>
-    </w:p>
-    <w:p>
-      <w:pPr>
-        <w:pStyle w:val="BodyText"/>
-        <w:bidi w:val="0"/>
-        <w:jc w:val="left"/>
-        <w:rPr/>
-      </w:pPr>
-      <w:r>
-        <w:rPr>
-          <w:rStyle w:val="Strong"/>
-        </w:rPr>
-        <w:t>A printed chassis, abandoned mid-project.</w:t>
-      </w:r>
-      <w:r>
-        <w:rPr/>
-        <w:t xml:space="preserve"> Four CAD revisions in, an available Meccano-style perforated metal chassis proved simpler and stronger than the printed deck. The pivot is described in §11.</w:t>
-      </w:r>
-    </w:p>
-    <w:p>
-      <w:pPr>
-        <w:pStyle w:val="HorizontalLine"/>
-        <w:bidi w:val="0"/>
-        <w:jc w:val="left"/>
-        <w:rPr/>
-      </w:pPr>
-      <w:r>
-        <w:rPr/>
+        <w:t xml:space="preserve"> identity, so other people or pets in frame just don't trigger anything.</w:t>
+      </w:r>
+    </w:p>
+    <w:p>
+      <w:pPr>
+        <w:pStyle w:val="BodyText"/>
+        <w:bidi w:val="0"/>
+        <w:jc w:val="left"/>
+        <w:rPr/>
+      </w:pPr>
+      <w:r>
+        <w:rPr/>
+        <w:t>I want to be clear this is a pragmatic call, not a claim that fiducials generally beat learned detectors. For a reliability-critical, single-subject, compute-constrained deployment like this one, the fiducial is the right engineering choice. Change any of those three conditions and the answer probably changes too.</w:t>
+      </w:r>
+    </w:p>
+    <w:p>
+      <w:pPr>
+        <w:pStyle w:val="BodyText"/>
+        <w:bidi w:val="0"/>
+        <w:jc w:val="left"/>
+        <w:rPr/>
+      </w:pPr>
+      <w:r>
+        <w:rPr>
+          <w:rStyle w:val="Strong"/>
+        </w:rPr>
+        <w:t>One single controller, rejected for failure isolation.</w:t>
+      </w:r>
+      <w:r>
+        <w:rPr/>
+        <w:t xml:space="preserve"> Putting everything on one board is simpler. I rejected it because it couples failure domains that really need to stay apart: a vision stall would delay motor commands, and a crash would take the safety watchdog down along with whatever it was watching. The three-tier split (§8.2) exists specifically so the real-time executor can never be starved by a network stall.</w:t>
+      </w:r>
+    </w:p>
+    <w:p>
+      <w:pPr>
+        <w:pStyle w:val="BodyText"/>
+        <w:bidi w:val="0"/>
+        <w:jc w:val="left"/>
+        <w:rPr/>
+      </w:pPr>
+      <w:r>
+        <w:rPr>
+          <w:rStyle w:val="Strong"/>
+        </w:rPr>
+        <w:t>A printed chassis, abandoned partway through.</w:t>
+      </w:r>
+      <w:r>
+        <w:rPr/>
+        <w:t xml:space="preserve"> After four CAD revisions, an available Meccano-style perforated metal chassis turned out to be simpler and stronger than the printed deck. I describe that switch in §11.</w:t>
       </w:r>
     </w:p>
     <w:p>
@@ -1110,7 +1062,7 @@
       </w:pPr>
       <w:r>
         <w:rPr/>
-        <w:t xml:space="preserve">Full detail in </w:t>
+        <w:t xml:space="preserve">Full detail is in </w:t>
       </w:r>
       <w:r>
         <w:rPr>
@@ -1130,7 +1082,7 @@
       </w:r>
       <w:r>
         <w:rPr/>
-        <w:t xml:space="preserve"> inverted the conventional build order: the stop path, the motion watchdog, and the exposure gate were built and tested </w:t>
+        <w:t xml:space="preserve"> flipped the usual build order upside down: the stop path, the motion watchdog, and the exposure gate all had to exist and be tested </w:t>
       </w:r>
       <w:r>
         <w:rPr>
@@ -1140,19 +1092,19 @@
       </w:r>
       <w:r>
         <w:rPr/>
-        <w:t xml:space="preserve"> the robot was allowed to move near the dog. "Get it driving, add safety later" was never an available plan here.</w:t>
-      </w:r>
-    </w:p>
-    <w:p>
-      <w:pPr>
-        <w:pStyle w:val="BodyText"/>
-        <w:bidi w:val="0"/>
-        <w:jc w:val="left"/>
-        <w:rPr/>
-      </w:pPr>
-      <w:r>
-        <w:rPr/>
-        <w:t xml:space="preserve">Subsystems were validated in isolation before integration, in the order specified by </w:t>
+        <w:t xml:space="preserve"> the robot was ever allowed near the dog at all. "Get it driving first, add safety later" was just never a plan I could actually use here.</w:t>
+      </w:r>
+    </w:p>
+    <w:p>
+      <w:pPr>
+        <w:pStyle w:val="BodyText"/>
+        <w:bidi w:val="0"/>
+        <w:jc w:val="left"/>
+        <w:rPr/>
+      </w:pPr>
+      <w:r>
+        <w:rPr/>
+        <w:t xml:space="preserve">Subsystems got validated on their own before integration, in the order set out in </w:t>
       </w:r>
       <w:r>
         <w:rPr>
@@ -1162,7 +1114,7 @@
       </w:r>
       <w:r>
         <w:rPr/>
-        <w:t>: motors, dispenser, sensors, inter-board link, vision, power, then the full loop. With three processors and two link protocols, a failure in an integrated system is expensive to localise, and an unvalidated subsystem operating near a frightened animal is a welfare risk, not merely a bug.</w:t>
+        <w:t>: motors, dispenser, sensors, the link between boards, vision, power, and only then the full loop. With three processors and two link protocols, tracking down a failure in the fully integrated system is expensive, and an unvalidated subsystem running near a frightened animal is a welfare risk, not just an ordinary bug.</w:t>
       </w:r>
     </w:p>
     <w:p>
@@ -1186,13 +1138,13 @@
       </w:pPr>
       <w:r>
         <w:rPr/>
-        <w:t xml:space="preserve">The project ran </w:t>
-      </w:r>
-      <w:r>
-        <w:rPr>
-          <w:rStyle w:val="Strong"/>
-        </w:rPr>
-        <w:t>2026-06-26 to 2026-07-19</w:t>
+        <w:t xml:space="preserve">The project ran from </w:t>
+      </w:r>
+      <w:r>
+        <w:rPr>
+          <w:rStyle w:val="Strong"/>
+        </w:rPr>
+        <w:t>June 26 to July 19, 2026</w:t>
       </w:r>
       <w:r>
         <w:rPr/>
@@ -1206,7 +1158,7 @@
       </w:r>
       <w:r>
         <w:rPr/>
-        <w:t xml:space="preserve"> across seven phases, with a real two-week pause between the public release (Jul 7) and the chassis pivot (Jul 19). </w:t>
+        <w:t xml:space="preserve"> across seven phases, with an actual two-week gap between the public release (July 7) and the chassis pivot (July 19). </w:t>
       </w:r>
       <w:r>
         <w:rPr>
@@ -1216,7 +1168,7 @@
       </w:r>
       <w:r>
         <w:rPr/>
-        <w:t xml:space="preserve"> gives the dated phase table and Gantt, traced to commits and to the dated results log in </w:t>
+        <w:t xml:space="preserve"> has the full dated phase table and Gantt chart, traced back to commits and to the dated results log in </w:t>
       </w:r>
       <w:r>
         <w:rPr>
@@ -1238,54 +1190,43 @@
       </w:pPr>
       <w:r>
         <w:rPr/>
-        <w:t>Two departures from plan:</w:t>
-      </w:r>
-    </w:p>
-    <w:p>
-      <w:pPr>
-        <w:pStyle w:val="BodyText"/>
-        <w:bidi w:val="0"/>
-        <w:jc w:val="left"/>
-        <w:rPr/>
-      </w:pPr>
-      <w:r>
-        <w:rPr>
-          <w:rStyle w:val="Strong"/>
-        </w:rPr>
-        <w:t>CAD cost far more than budgeted.</w:t>
-      </w:r>
-      <w:r>
-        <w:rPr/>
-        <w:t xml:space="preserve"> Four revisions, each with a mechanical interference that appeared only once printed, at a full print cycle per attempt.</w:t>
-      </w:r>
-    </w:p>
-    <w:p>
-      <w:pPr>
-        <w:pStyle w:val="BodyText"/>
-        <w:bidi w:val="0"/>
-        <w:jc w:val="left"/>
-        <w:rPr/>
-      </w:pPr>
-      <w:r>
-        <w:rPr>
-          <w:rStyle w:val="Strong"/>
-        </w:rPr>
-        <w:t>Phase 7 wasn't planned at all.</w:t>
-      </w:r>
-      <w:r>
-        <w:rPr/>
-        <w:t xml:space="preserve"> The chassis pivot forced a re-derivation of the mounting layout, wiring plan, and assembly order that had all assumed a printed deck.</w:t>
-      </w:r>
-    </w:p>
-    <w:p>
-      <w:pPr>
-        <w:pStyle w:val="HorizontalLine"/>
-        <w:bidi w:val="0"/>
-        <w:jc w:val="left"/>
-        <w:rPr/>
-      </w:pPr>
-      <w:r>
-        <w:rPr/>
+        <w:t>Two things didn't go to plan:</w:t>
+      </w:r>
+    </w:p>
+    <w:p>
+      <w:pPr>
+        <w:pStyle w:val="BodyText"/>
+        <w:bidi w:val="0"/>
+        <w:jc w:val="left"/>
+        <w:rPr/>
+      </w:pPr>
+      <w:r>
+        <w:rPr>
+          <w:rStyle w:val="Strong"/>
+        </w:rPr>
+        <w:t>CAD cost way more than I budgeted.</w:t>
+      </w:r>
+      <w:r>
+        <w:rPr/>
+        <w:t xml:space="preserve"> Four revisions, each with a mechanical interference that only showed up once it was actually printed, which meant a full print cycle per attempt.</w:t>
+      </w:r>
+    </w:p>
+    <w:p>
+      <w:pPr>
+        <w:pStyle w:val="BodyText"/>
+        <w:bidi w:val="0"/>
+        <w:jc w:val="left"/>
+        <w:rPr/>
+      </w:pPr>
+      <w:r>
+        <w:rPr>
+          <w:rStyle w:val="Strong"/>
+        </w:rPr>
+        <w:t>Phase 7 wasn't in the plan at all.</w:t>
+      </w:r>
+      <w:r>
+        <w:rPr/>
+        <w:t xml:space="preserve"> The chassis pivot forced me to re-derive the whole mounting layout, wiring plan, and assembly order, since all of it had assumed a printed deck that no longer existed.</w:t>
       </w:r>
     </w:p>
     <w:p>
@@ -1311,57 +1252,57 @@
         <w:rPr>
           <w:rStyle w:val="Strong"/>
         </w:rPr>
-        <w:t>Three processors, each matched to what it does best.</w:t>
-      </w:r>
-      <w:r>
-        <w:rPr/>
-        <w:t xml:space="preserve"> An unusual amount of hardware for a school project, justified by failure isolation rather than capability. An Arduino Uno as the real-time executor ("limbs") for jitter-free servo and motor timing, kept deliberately dumb and reliable. An ESP32 ("brain") running the arousal state machine and coordinating both other tiers. A Raspberry Pi 5 ("eyes and face") for OpenCV vision and the Flask dashboard, which also owns the wall clock.</w:t>
-      </w:r>
-    </w:p>
-    <w:p>
-      <w:pPr>
-        <w:pStyle w:val="BodyText"/>
-        <w:bidi w:val="0"/>
-        <w:jc w:val="left"/>
-        <w:rPr/>
-      </w:pPr>
-      <w:r>
-        <w:rPr>
-          <w:rStyle w:val="Strong"/>
-        </w:rPr>
-        <w:t>Working with what was available.</w:t>
-      </w:r>
-      <w:r>
-        <w:rPr/>
-        <w:t xml:space="preserve"> The most useful resource decision was abandoning four revisions of printed-chassis CAD when a perforated metal chassis turned out to be simpler and stronger. That meant accepting that the castor's 24 mm bolt circle and the dispenser's three feet at 25 mm radius, 120° apart, don't land on a 10 mm square grid cleanly. Resolved by bolting whichever foot lands on a real hole and zip-tying the rest, recorded honestly rather than pretending the grid and the CAD agree.</w:t>
-      </w:r>
-    </w:p>
-    <w:p>
-      <w:pPr>
-        <w:pStyle w:val="BodyText"/>
-        <w:bidi w:val="0"/>
-        <w:jc w:val="left"/>
-        <w:rPr/>
-      </w:pPr>
-      <w:r>
-        <w:rPr>
-          <w:rStyle w:val="Strong"/>
-        </w:rPr>
-        <w:t>People, stated accurately, including the gap.</w:t>
-      </w:r>
-      <w:r>
-        <w:rPr/>
-        <w:t xml:space="preserve"> This was a solo build, and the honest position is that the expertise this project most needs was </w:t>
+        <w:t>Three processors, each doing what it's actually good at.</w:t>
+      </w:r>
+      <w:r>
+        <w:rPr/>
+        <w:t xml:space="preserve"> That's an unusual amount of hardware for a school project, and it's justified by failure isolation, not raw capability. An Arduino Uno as the real-time executor ("limbs") for jitter-free servo and motor timing, kept deliberately dumb and reliable on purpose. An ESP32 ("brain") running the arousal state machine and coordinating the other two tiers. A Raspberry Pi 5 ("eyes and face") for OpenCV vision and the Flask dashboard, which also keeps the wall clock.</w:t>
+      </w:r>
+    </w:p>
+    <w:p>
+      <w:pPr>
+        <w:pStyle w:val="BodyText"/>
+        <w:bidi w:val="0"/>
+        <w:jc w:val="left"/>
+        <w:rPr/>
+      </w:pPr>
+      <w:r>
+        <w:rPr>
+          <w:rStyle w:val="Strong"/>
+        </w:rPr>
+        <w:t>Working with what I actually had.</w:t>
+      </w:r>
+      <w:r>
+        <w:rPr/>
+        <w:t xml:space="preserve"> The best resource decision I made was giving up on four revisions of printed-chassis CAD once I realised a perforated metal chassis was simpler and stronger. That meant accepting that the castor's 24 mm bolt circle and the dispenser's three feet, at 25 mm radius and 120° apart, just don't land cleanly on a 10 mm grid. I solved it by bolting whichever foot happened to land on a real hole and zip-tying the rest, and I've recorded that honestly rather than pretending the grid and the CAD actually line up.</w:t>
+      </w:r>
+    </w:p>
+    <w:p>
+      <w:pPr>
+        <w:pStyle w:val="BodyText"/>
+        <w:bidi w:val="0"/>
+        <w:jc w:val="left"/>
+        <w:rPr/>
+      </w:pPr>
+      <w:r>
+        <w:rPr>
+          <w:rStyle w:val="Strong"/>
+        </w:rPr>
+        <w:t>People, including being honest about the gap.</w:t>
+      </w:r>
+      <w:r>
+        <w:rPr/>
+        <w:t xml:space="preserve"> This was a solo build, and the honest answer is that the expertise this project actually needs was </w:t>
       </w:r>
       <w:r>
         <w:rPr>
           <w:rStyle w:val="Emphasis"/>
         </w:rPr>
-        <w:t>identified but not engaged</w:t>
-      </w:r>
-      <w:r>
-        <w:rPr/>
-        <w:t>: paper §8 names prior review by an animal-research ethics body and/or a qualified veterinary behaviourist as a requirement before any efficacy claim could be made. That review hasn't been sought, which is precisely why the project is scoped to make no such claim. Knowing which expert you'd need, and scoping your claims to what you can support without them, is the responsible version of working alone. No mentor was used for this project. It was built independently throughout, and the profile form's mentor field is left blank accordingly.</w:t>
+        <w:t>identified but never brought in</w:t>
+      </w:r>
+      <w:r>
+        <w:rPr/>
+        <w:t>: paper §8 names prior review from an animal-research ethics body and/or a qualified veterinary behaviourist as something that would be required before making any efficacy claim. I haven't sought that review, which is exactly why the project is scoped to not make that claim at all. Knowing which expert you'd actually need, and scoping your claims to what you can support without them, feels like the responsible version of working alone rather than just pretending you didn't need help. I didn't use a mentor for this project. It was built independently the whole way through, and the profile form's mentor field is left blank for that reason.</w:t>
       </w:r>
     </w:p>
     <w:p>
@@ -1379,18 +1320,7 @@
       </w:r>
       <w:r>
         <w:rPr/>
-        <w:t xml:space="preserve"> The dog is a family pet, and his participation is bounded by supervision, the welfare gate, and an owner who can end any session at will (§12).</w:t>
-      </w:r>
-    </w:p>
-    <w:p>
-      <w:pPr>
-        <w:pStyle w:val="HorizontalLine"/>
-        <w:bidi w:val="0"/>
-        <w:jc w:val="left"/>
-        <w:rPr/>
-      </w:pPr>
-      <w:r>
-        <w:rPr/>
+        <w:t xml:space="preserve"> The dog is a family pet, and everything he does here is bounded by supervision, the welfare gate, and an owner (me) who can end any session whenever I want (§12).</w:t>
       </w:r>
     </w:p>
     <w:p>
@@ -1414,19 +1344,19 @@
       </w:pPr>
       <w:r>
         <w:rPr/>
-        <w:t>Three sources ground the specific claims; full citations in §16, discussion in paper §2.</w:t>
-      </w:r>
-    </w:p>
-    <w:p>
-      <w:pPr>
-        <w:pStyle w:val="BodyText"/>
-        <w:bidi w:val="0"/>
-        <w:jc w:val="left"/>
-        <w:rPr/>
-      </w:pPr>
-      <w:r>
-        <w:rPr/>
-        <w:t xml:space="preserve">The conditioning model rests on established practice in using reward to change a fear response </w:t>
+        <w:t>Three sources back up the specific claims I'm making; full citations in §16, and the related-work discussion is in paper §2.</w:t>
+      </w:r>
+    </w:p>
+    <w:p>
+      <w:pPr>
+        <w:pStyle w:val="BodyText"/>
+        <w:bidi w:val="0"/>
+        <w:jc w:val="left"/>
+        <w:rPr/>
+      </w:pPr>
+      <w:r>
+        <w:rPr/>
+        <w:t xml:space="preserve">The conditioning model here relies on established practice around using reward to shift a fear response </w:t>
       </w:r>
       <w:r>
         <w:rPr>
@@ -1436,7 +1366,7 @@
       </w:r>
       <w:r>
         <w:rPr/>
-        <w:t xml:space="preserve"> the animal [1]. Flooding, forced exposure to the feared stimulus, is exactly what a naively-designed robot does, and the gradual-exposure architecture (§8.5) exists to avoid it. The staged, criterion-gated structure of the exposure protocol follows the standardised training-program model in [2]. The perception layer uses the ArUco fiducial detection algorithm directly [3], which also supplies the justification for the ArUco-over-YOLO argument in §3.</w:t>
+        <w:t xml:space="preserve"> the animal [1]. Flooding, forcing exposure to whatever's scaring the animal, is exactly what a badly-designed robot like this would end up doing by accident, and the gradual-exposure architecture (§8.5) exists specifically to avoid it. The staged, criterion-gated shape of the exposure protocol follows the standardised training-program model in [2]. The perception layer uses the ArUco fiducial detection algorithm directly [3], which is also where the ArUco-over-YOLO argument in §3 comes from.</w:t>
       </w:r>
     </w:p>
     <w:p>
@@ -1450,11 +1380,11 @@
         <w:rPr>
           <w:rStyle w:val="Strong"/>
         </w:rPr>
-        <w:t>To strengthen (criterion 2.2):</w:t>
-      </w:r>
-      <w:r>
-        <w:rPr/>
-        <w:t xml:space="preserve"> three citations is adequate but thin against LYRA's six. Two additions would harden it materially: a source on canine fear-response and body-language coding, which the exposure protocol needs anyway to define its advance/hold/retreat criteria, and one on reinforcement timing and delay-of-reward, which bears directly on the ~5 to 9 s reward latency identified as a validity risk in </w:t>
+        <w:t>Where this is thin (criterion 2.2):</w:t>
+      </w:r>
+      <w:r>
+        <w:rPr/>
+        <w:t xml:space="preserve"> three citations is fine but it's the thinner of my two projects, LYRA has six. Two more would genuinely help: something on canine fear-response and body-language coding, which the exposure protocol needs anyway to actually define its advance/hold/retreat criteria, and something on reinforcement timing and delay-of-reward, which relates directly to the ~5 to 9 second reward latency I've flagged as a validity risk in </w:t>
       </w:r>
       <w:r>
         <w:rPr>
@@ -1469,17 +1399,6 @@
     </w:p>
     <w:p>
       <w:pPr>
-        <w:pStyle w:val="HorizontalLine"/>
-        <w:bidi w:val="0"/>
-        <w:jc w:val="left"/>
-        <w:rPr/>
-      </w:pPr>
-      <w:r>
-        <w:rPr/>
-      </w:r>
-    </w:p>
-    <w:p>
-      <w:pPr>
         <w:pStyle w:val="Heading2"/>
         <w:bidi w:val="0"/>
         <w:jc w:val="left"/>
@@ -1511,7 +1430,7 @@
       </w:pPr>
       <w:r>
         <w:rPr/>
-        <w:t>Three constraints drove every later decision (paper §3.1):</w:t>
+        <w:t>Three constraints drove basically every decision after this (paper §3.1):</w:t>
       </w:r>
     </w:p>
     <w:p>
@@ -1539,7 +1458,7 @@
       </w:r>
       <w:r>
         <w:rPr/>
-        <w:t xml:space="preserve"> Motion is a hazard to be rationed. This makes "stops reliably and quickly" a safety requirement, and "functions while not moving at all" a first-class operating mode. </w:t>
+        <w:t xml:space="preserve"> Motion is a hazard to be rationed. That makes "stops reliably and quickly" a safety requirement, and "works fine while not moving at all" a proper, first-class mode, not a fallback. </w:t>
       </w:r>
     </w:p>
     <w:p>
@@ -1594,7 +1513,7 @@
       </w:r>
       <w:r>
         <w:rPr/>
-        <w:t xml:space="preserve">, named and co-located in firmware and in the dashboard simulator, and documented as provisional rather than settled. </w:t>
+        <w:t xml:space="preserve">, named and kept in one place in both the firmware and the dashboard simulator, and documented as provisional rather than settled science. </w:t>
       </w:r>
     </w:p>
     <w:p>
@@ -1611,21 +1530,21 @@
     </w:p>
     <w:tbl>
       <w:tblPr>
-        <w:tblW w:w="11339" w:type="dxa"/>
         <w:jc w:val="left"/>
         <w:tblInd w:w="28" w:type="dxa"/>
-        <w:tblLayout w:type="fixed"/>
         <w:tblCellMar>
           <w:top w:w="28" w:type="dxa"/>
           <w:left w:w="28" w:type="dxa"/>
           <w:bottom w:w="28" w:type="dxa"/>
           <w:right w:w="28" w:type="dxa"/>
         </w:tblCellMar>
+        <w:tblLayout w:type="fixed"/>
+        <w:tblW w:w="9072" w:type="dxa"/>
       </w:tblPr>
       <w:tblGrid>
-        <w:gridCol w:w="2389"/>
-        <w:gridCol w:w="4241"/>
-        <w:gridCol w:w="4709"/>
+        <w:gridCol w:w="1457"/>
+        <w:gridCol w:w="2976"/>
+        <w:gridCol w:w="4639"/>
       </w:tblGrid>
       <w:tr>
         <w:trPr>
@@ -1633,15 +1552,14 @@
         </w:trPr>
         <w:tc>
           <w:tcPr>
-            <w:tcW w:w="2389" w:type="dxa"/>
-            <w:tcBorders/>
-            <w:vAlign w:val="center"/>
+            <w:tcBorders/>
+            <w:vAlign w:val="center"/>
+            <w:tcW w:w="1457" w:type="dxa"/>
           </w:tcPr>
           <w:p>
             <w:pPr>
               <w:pStyle w:val="TableHeading"/>
               <w:suppressLineNumbers/>
-              <w:shd w:fill="EEEEEE" w:val="clear"/>
               <w:bidi w:val="0"/>
               <w:spacing w:before="0" w:after="283"/>
               <w:jc w:val="left"/>
@@ -1655,15 +1573,14 @@
         </w:tc>
         <w:tc>
           <w:tcPr>
-            <w:tcW w:w="4241" w:type="dxa"/>
-            <w:tcBorders/>
-            <w:vAlign w:val="center"/>
+            <w:tcBorders/>
+            <w:vAlign w:val="center"/>
+            <w:tcW w:w="2976" w:type="dxa"/>
           </w:tcPr>
           <w:p>
             <w:pPr>
               <w:pStyle w:val="TableHeading"/>
               <w:suppressLineNumbers/>
-              <w:shd w:fill="EEEEEE" w:val="clear"/>
               <w:bidi w:val="0"/>
               <w:spacing w:before="0" w:after="283"/>
               <w:jc w:val="left"/>
@@ -1677,23 +1594,22 @@
         </w:tc>
         <w:tc>
           <w:tcPr>
-            <w:tcW w:w="4709" w:type="dxa"/>
-            <w:tcBorders/>
-            <w:vAlign w:val="center"/>
+            <w:tcBorders/>
+            <w:vAlign w:val="center"/>
+            <w:tcW w:w="4639" w:type="dxa"/>
           </w:tcPr>
           <w:p>
             <w:pPr>
               <w:pStyle w:val="TableHeading"/>
               <w:suppressLineNumbers/>
-              <w:shd w:fill="EEEEEE" w:val="clear"/>
-              <w:bidi w:val="0"/>
-              <w:spacing w:before="0" w:after="283"/>
-              <w:jc w:val="left"/>
-              <w:rPr/>
-            </w:pPr>
-            <w:r>
-              <w:rPr/>
-              <w:t>Why here</w:t>
+              <w:bidi w:val="0"/>
+              <w:spacing w:before="0" w:after="283"/>
+              <w:jc w:val="left"/>
+              <w:rPr/>
+            </w:pPr>
+            <w:r>
+              <w:rPr/>
+              <w:t>Why it's here</w:t>
             </w:r>
           </w:p>
         </w:tc>
@@ -1702,9 +1618,9 @@
         <w:trPr/>
         <w:tc>
           <w:tcPr>
-            <w:tcW w:w="2389" w:type="dxa"/>
-            <w:tcBorders/>
-            <w:vAlign w:val="center"/>
+            <w:tcBorders/>
+            <w:vAlign w:val="center"/>
+            <w:tcW w:w="1457" w:type="dxa"/>
           </w:tcPr>
           <w:p>
             <w:pPr>
@@ -1722,9 +1638,9 @@
         </w:tc>
         <w:tc>
           <w:tcPr>
-            <w:tcW w:w="4241" w:type="dxa"/>
-            <w:tcBorders/>
-            <w:vAlign w:val="center"/>
+            <w:tcBorders/>
+            <w:vAlign w:val="center"/>
+            <w:tcW w:w="2976" w:type="dxa"/>
           </w:tcPr>
           <w:p>
             <w:pPr>
@@ -1742,21 +1658,21 @@
         </w:tc>
         <w:tc>
           <w:tcPr>
-            <w:tcW w:w="4709" w:type="dxa"/>
-            <w:tcBorders/>
-            <w:vAlign w:val="center"/>
-          </w:tcPr>
-          <w:p>
-            <w:pPr>
-              <w:pStyle w:val="TableContents"/>
-              <w:bidi w:val="0"/>
-              <w:spacing w:before="0" w:after="283"/>
-              <w:jc w:val="left"/>
-              <w:rPr/>
-            </w:pPr>
-            <w:r>
-              <w:rPr/>
-              <w:t>Jitter-free 5 V timing; deliberately dumb and reliable</w:t>
+            <w:tcBorders/>
+            <w:vAlign w:val="center"/>
+            <w:tcW w:w="4639" w:type="dxa"/>
+          </w:tcPr>
+          <w:p>
+            <w:pPr>
+              <w:pStyle w:val="TableContents"/>
+              <w:bidi w:val="0"/>
+              <w:spacing w:before="0" w:after="283"/>
+              <w:jc w:val="left"/>
+              <w:rPr/>
+            </w:pPr>
+            <w:r>
+              <w:rPr/>
+              <w:t>Jitter-free 5 V timing; kept deliberately dumb and reliable</w:t>
             </w:r>
           </w:p>
         </w:tc>
@@ -1765,9 +1681,9 @@
         <w:trPr/>
         <w:tc>
           <w:tcPr>
-            <w:tcW w:w="2389" w:type="dxa"/>
-            <w:tcBorders/>
-            <w:vAlign w:val="center"/>
+            <w:tcBorders/>
+            <w:vAlign w:val="center"/>
+            <w:tcW w:w="1457" w:type="dxa"/>
           </w:tcPr>
           <w:p>
             <w:pPr>
@@ -1785,9 +1701,9 @@
         </w:tc>
         <w:tc>
           <w:tcPr>
-            <w:tcW w:w="4241" w:type="dxa"/>
-            <w:tcBorders/>
-            <w:vAlign w:val="center"/>
+            <w:tcBorders/>
+            <w:vAlign w:val="center"/>
+            <w:tcW w:w="2976" w:type="dxa"/>
           </w:tcPr>
           <w:p>
             <w:pPr>
@@ -1805,21 +1721,21 @@
         </w:tc>
         <w:tc>
           <w:tcPr>
-            <w:tcW w:w="4709" w:type="dxa"/>
-            <w:tcBorders/>
-            <w:vAlign w:val="center"/>
-          </w:tcPr>
-          <w:p>
-            <w:pPr>
-              <w:pStyle w:val="TableContents"/>
-              <w:bidi w:val="0"/>
-              <w:spacing w:before="0" w:after="283"/>
-              <w:jc w:val="left"/>
-              <w:rPr/>
-            </w:pPr>
-            <w:r>
-              <w:rPr/>
-              <w:t>Enough compute for the state machine plus WiFi to coordinate</w:t>
+            <w:tcBorders/>
+            <w:vAlign w:val="center"/>
+            <w:tcW w:w="4639" w:type="dxa"/>
+          </w:tcPr>
+          <w:p>
+            <w:pPr>
+              <w:pStyle w:val="TableContents"/>
+              <w:bidi w:val="0"/>
+              <w:spacing w:before="0" w:after="283"/>
+              <w:jc w:val="left"/>
+              <w:rPr/>
+            </w:pPr>
+            <w:r>
+              <w:rPr/>
+              <w:t>Enough compute for the state machine plus WiFi to coordinate everything</w:t>
             </w:r>
           </w:p>
         </w:tc>
@@ -1828,9 +1744,9 @@
         <w:trPr/>
         <w:tc>
           <w:tcPr>
-            <w:tcW w:w="2389" w:type="dxa"/>
-            <w:tcBorders/>
-            <w:vAlign w:val="center"/>
+            <w:tcBorders/>
+            <w:vAlign w:val="center"/>
+            <w:tcW w:w="1457" w:type="dxa"/>
           </w:tcPr>
           <w:p>
             <w:pPr>
@@ -1848,9 +1764,9 @@
         </w:tc>
         <w:tc>
           <w:tcPr>
-            <w:tcW w:w="4241" w:type="dxa"/>
-            <w:tcBorders/>
-            <w:vAlign w:val="center"/>
+            <w:tcBorders/>
+            <w:vAlign w:val="center"/>
+            <w:tcW w:w="2976" w:type="dxa"/>
           </w:tcPr>
           <w:p>
             <w:pPr>
@@ -1868,21 +1784,21 @@
         </w:tc>
         <w:tc>
           <w:tcPr>
-            <w:tcW w:w="4709" w:type="dxa"/>
-            <w:tcBorders/>
-            <w:vAlign w:val="center"/>
-          </w:tcPr>
-          <w:p>
-            <w:pPr>
-              <w:pStyle w:val="TableContents"/>
-              <w:bidi w:val="0"/>
-              <w:spacing w:before="0" w:after="283"/>
-              <w:jc w:val="left"/>
-              <w:rPr/>
-            </w:pPr>
-            <w:r>
-              <w:rPr/>
-              <w:t>Vision and a web UI exceed either MCU; the Pi owns the wall clock</w:t>
+            <w:tcBorders/>
+            <w:vAlign w:val="center"/>
+            <w:tcW w:w="4639" w:type="dxa"/>
+          </w:tcPr>
+          <w:p>
+            <w:pPr>
+              <w:pStyle w:val="TableContents"/>
+              <w:bidi w:val="0"/>
+              <w:spacing w:before="0" w:after="283"/>
+              <w:jc w:val="left"/>
+              <w:rPr/>
+            </w:pPr>
+            <w:r>
+              <w:rPr/>
+              <w:t>Vision and a web UI need more than either MCU can give; the Pi keeps the wall clock</w:t>
             </w:r>
           </w:p>
         </w:tc>
@@ -1897,7 +1813,7 @@
       </w:pPr>
       <w:r>
         <w:rPr/>
-        <w:t xml:space="preserve">The split isolates failure domains. The real-time executor can't be starved by a network stall, and the decision tier </w:t>
+        <w:t xml:space="preserve">The split keeps failure domains separate. The real-time executor can't be starved by a network stall, and the decision tier </w:t>
       </w:r>
       <w:r>
         <w:rPr>
@@ -1907,7 +1823,7 @@
       </w:r>
       <w:r>
         <w:rPr/>
-        <w:t xml:space="preserve"> the Pi rather than being driven synchronously by it, so vision going away degrades the system instead of blocking it.</w:t>
+        <w:t xml:space="preserve"> the Pi instead of being driven by it synchronously, so vision dropping out just degrades the system instead of blocking it entirely.</w:t>
       </w:r>
     </w:p>
     <w:p>
@@ -1931,7 +1847,7 @@
       </w:pPr>
       <w:r>
         <w:rPr/>
-        <w:t xml:space="preserve">Two independent sources. Locally, the ESP32 fuses a PIR sensor with three ultrasonic rangefinders (left, centre, right), fired sequentially to avoid echo cross-talk, the trio doubling as a coarse bearing. Remotely, the Pi detects the collar's ArUco marker and posts a </w:t>
+        <w:t xml:space="preserve">Two independent sources feed into this. Locally, the ESP32 combines a PIR sensor with three ultrasonic rangefinders (left, centre, right), fired one after another to avoid echo cross-talk, which also gives a rough bearing. Remotely, the Pi picks up the collar's ArUco marker and posts a </w:t>
       </w:r>
       <w:r>
         <w:rPr>
@@ -1941,19 +1857,19 @@
       </w:r>
       <w:r>
         <w:rPr/>
-        <w:t>, not imagery, which the ESP32 polls. Frame-skipping and a Laplacian-variance blur guard reject motion-blurred frames rather than classifying them.</w:t>
-      </w:r>
-    </w:p>
-    <w:p>
-      <w:pPr>
-        <w:pStyle w:val="BodyText"/>
-        <w:bidi w:val="0"/>
-        <w:jc w:val="left"/>
-        <w:rPr/>
-      </w:pPr>
-      <w:r>
-        <w:rPr/>
-        <w:t xml:space="preserve">Ultrasonics give range, not identity; they can't distinguish the dog from a wall. This is why, while moving, the dog is identified by the camera marker </w:t>
+        <w:t>, not any actual imagery, which the ESP32 then polls. Frame-skipping and a Laplacian-variance blur check reject motion-blurred frames instead of trying to classify them.</w:t>
+      </w:r>
+    </w:p>
+    <w:p>
+      <w:pPr>
+        <w:pStyle w:val="BodyText"/>
+        <w:bidi w:val="0"/>
+        <w:jc w:val="left"/>
+        <w:rPr/>
+      </w:pPr>
+      <w:r>
+        <w:rPr/>
+        <w:t xml:space="preserve">Ultrasonics give you range, not identity, so they genuinely can't tell the dog apart from a wall. That's exactly why, while the robot's moving, the dog is identified by the camera marker </w:t>
       </w:r>
       <w:r>
         <w:rPr>
@@ -1963,7 +1879,7 @@
       </w:r>
       <w:r>
         <w:rPr/>
-        <w:t xml:space="preserve">, a constraint honestly recorded in </w:t>
+        <w:t xml:space="preserve">, and I've recorded that constraint honestly in </w:t>
       </w:r>
       <w:r>
         <w:rPr>
@@ -1973,7 +1889,7 @@
       </w:r>
       <w:r>
         <w:rPr/>
-        <w:t xml:space="preserve"> §A rather than glossed over.</w:t>
+        <w:t xml:space="preserve"> §A instead of glossing over it.</w:t>
       </w:r>
     </w:p>
     <w:p>
@@ -2007,7 +1923,7 @@
       </w:r>
       <w:r>
         <w:rPr/>
-        <w:t xml:space="preserve"> level in [0, 100] drives three states, </w:t>
+        <w:t xml:space="preserve"> value between 0 and 100 drives three states, </w:t>
       </w:r>
       <w:r>
         <w:rPr>
@@ -2027,7 +1943,7 @@
       </w:r>
       <w:r>
         <w:rPr/>
-        <w:t xml:space="preserve">, </w:t>
+        <w:t xml:space="preserve">, and </w:t>
       </w:r>
       <w:r>
         <w:rPr>
@@ -2047,19 +1963,19 @@
       </w:r>
       <w:r>
         <w:rPr/>
-        <w:t>: separate enter and exit thresholds, so arousal has to climb clearly past one line to turn a state on and fall clearly past a lower line to turn it off. Without hysteresis, a dog sitting exactly at a threshold made the state flip every 20 ms, re-firing the buzzer dozens of times for one continuous event (§9).</w:t>
-      </w:r>
-    </w:p>
-    <w:p>
-      <w:pPr>
-        <w:pStyle w:val="BodyText"/>
-        <w:bidi w:val="0"/>
-        <w:jc w:val="left"/>
-        <w:rPr/>
-      </w:pPr>
-      <w:r>
-        <w:rPr/>
-        <w:t xml:space="preserve">Two numerical safeguards protect the arousal integration. </w:t>
+        <w:t>: separate enter and exit thresholds, so arousal has to climb clearly past one line to switch a state on, and fall clearly past a lower line to switch it back off. Without hysteresis, a dog sitting right at the threshold made the state flip every 20 ms, which re-fired the buzzer dozens of times for one continuous event (§9).</w:t>
+      </w:r>
+    </w:p>
+    <w:p>
+      <w:pPr>
+        <w:pStyle w:val="BodyText"/>
+        <w:bidi w:val="0"/>
+        <w:jc w:val="left"/>
+        <w:rPr/>
+      </w:pPr>
+      <w:r>
+        <w:rPr/>
+        <w:t xml:space="preserve">Two numerical safeguards protect that integration. </w:t>
       </w:r>
       <w:r>
         <w:rPr>
@@ -2069,7 +1985,7 @@
       </w:r>
       <w:r>
         <w:rPr/>
-        <w:t xml:space="preserve"> is clamped to 0.2 s per tick, so a single stalled loop iteration can't make </w:t>
+        <w:t xml:space="preserve"> gets clamped to 0.2 s per tick, so a single stalled loop iteration can't make </w:t>
       </w:r>
       <w:r>
         <w:rPr>
@@ -2079,7 +1995,7 @@
       </w:r>
       <w:r>
         <w:rPr/>
-        <w:t xml:space="preserve"> teleport the system from calm to a full correction in one step. And the vision latch clears itself on a local 4-second timeout rather than waiting for a network round-trip (§9).</w:t>
+        <w:t xml:space="preserve"> jump the system straight from calm to a full correction in one step. And the vision latch clears itself on a local 4-second timeout instead of waiting on a network round-trip (§9).</w:t>
       </w:r>
     </w:p>
     <w:p>
@@ -2097,7 +2013,7 @@
       </w:r>
       <w:r>
         <w:rPr/>
-        <w:t xml:space="preserve"> The real-time Arduino runs a motion watchdog and halts within ~1 s of its command link going silent. A crashed ESP32, a dead router, or a pulled cable therefore all fail to </w:t>
+        <w:t xml:space="preserve"> The real-time Arduino runs a motion watchdog that halts within ~1 s of its command link going quiet. That means a crashed ESP32, a dead router, or a pulled cable all fail to </w:t>
       </w:r>
       <w:r>
         <w:rPr>
@@ -2117,7 +2033,7 @@
       </w:r>
       <w:r>
         <w:rPr/>
-        <w:t>. Motors also stop on any reset.</w:t>
+        <w:t>. Motors also stop on any reset, no exceptions.</w:t>
       </w:r>
     </w:p>
     <w:p>
@@ -2129,7 +2045,7 @@
       </w:pPr>
       <w:r>
         <w:rPr/>
-        <w:t>8.5 The gradual-exposure gate: welfare as one knob</w:t>
+        <w:t>8.5 The gradual-exposure gate: welfare boiled down to one knob</w:t>
       </w:r>
     </w:p>
     <w:p>
@@ -2147,7 +2063,7 @@
       </w:r>
       <w:r>
         <w:rPr/>
-        <w:t xml:space="preserve"> concentrates welfare into a single explicit control, described in the code as "the welfare knob." It </w:t>
+        <w:t xml:space="preserve"> puts welfare behind a single explicit control, described right there in the code as "the welfare knob." It </w:t>
       </w:r>
       <w:r>
         <w:rPr>
@@ -2157,40 +2073,29 @@
       </w:r>
       <w:r>
         <w:rPr/>
-        <w:t>, and the system remains fully useful there, delivering marker and reward with no motion whatsoever. Levels advance one step at a time, only when the dog's logged fear response shows tolerance, and every step is reversible. Escalation requires a two-key arm-then-confirm rather than one keypress, and exposure resets to 0 on boot.</w:t>
-      </w:r>
-    </w:p>
-    <w:p>
-      <w:pPr>
-        <w:pStyle w:val="BodyText"/>
-        <w:bidi w:val="0"/>
-        <w:jc w:val="left"/>
-        <w:rPr/>
-      </w:pPr>
-      <w:r>
-        <w:rPr/>
-        <w:t xml:space="preserve">The architectural point is that this </w:t>
-      </w:r>
-      <w:r>
-        <w:rPr>
-          <w:rStyle w:val="Strong"/>
-        </w:rPr>
-        <w:t>decouples what the robot decides from how much it's allowed to physically move.</w:t>
-      </w:r>
-      <w:r>
-        <w:rPr/>
-        <w:t xml:space="preserve"> The decision logic can be developed, debugged, and run at full capability while the physical envelope stays at zero.</w:t>
-      </w:r>
-    </w:p>
-    <w:p>
-      <w:pPr>
-        <w:pStyle w:val="HorizontalLine"/>
-        <w:bidi w:val="0"/>
-        <w:jc w:val="left"/>
-        <w:rPr/>
-      </w:pPr>
-      <w:r>
-        <w:rPr/>
+        <w:t>, and the system is still fully useful there, delivering marker and reward with zero motion. Levels only go up one at a time, only when the dog's logged fear response shows he's comfortable, and every step can be reversed. Going up a level needs a two-key arm-then-confirm instead of just one keypress, and exposure resets back to 0 on every boot.</w:t>
+      </w:r>
+    </w:p>
+    <w:p>
+      <w:pPr>
+        <w:pStyle w:val="BodyText"/>
+        <w:bidi w:val="0"/>
+        <w:jc w:val="left"/>
+        <w:rPr/>
+      </w:pPr>
+      <w:r>
+        <w:rPr/>
+        <w:t xml:space="preserve">The actual architectural point here is that this </w:t>
+      </w:r>
+      <w:r>
+        <w:rPr>
+          <w:rStyle w:val="Strong"/>
+        </w:rPr>
+        <w:t>separates what the robot decides from how much it's physically allowed to move.</w:t>
+      </w:r>
+      <w:r>
+        <w:rPr/>
+        <w:t xml:space="preserve"> I can develop, debug, and fully run the decision logic while the physical envelope stays completely at zero.</w:t>
       </w:r>
     </w:p>
     <w:p>
@@ -2202,25 +2107,25 @@
       </w:pPr>
       <w:r>
         <w:rPr/>
-        <w:t>9. Problems identified and overcome</w:t>
-      </w:r>
-    </w:p>
-    <w:p>
-      <w:pPr>
-        <w:pStyle w:val="BodyText"/>
-        <w:bidi w:val="0"/>
-        <w:jc w:val="left"/>
-        <w:rPr/>
-      </w:pPr>
-      <w:r>
-        <w:rPr>
-          <w:rStyle w:val="Strong"/>
-        </w:rPr>
-        <w:t>A latch that could never clear.</w:t>
-      </w:r>
-      <w:r>
-        <w:rPr/>
-        <w:t xml:space="preserve"> The ESP32 decided "is the dog here?" partly from a vision flag latched in </w:t>
+        <w:t>9. Problems I found and actually fixed</w:t>
+      </w:r>
+    </w:p>
+    <w:p>
+      <w:pPr>
+        <w:pStyle w:val="BodyText"/>
+        <w:bidi w:val="0"/>
+        <w:jc w:val="left"/>
+        <w:rPr/>
+      </w:pPr>
+      <w:r>
+        <w:rPr>
+          <w:rStyle w:val="Strong"/>
+        </w:rPr>
+        <w:t>A latch that could never clear itself.</w:t>
+      </w:r>
+      <w:r>
+        <w:rPr/>
+        <w:t xml:space="preserve"> The ESP32 decided "is the dog here?" partly from a vision flag stored in </w:t>
       </w:r>
       <w:r>
         <w:rPr>
@@ -2230,7 +2135,7 @@
       </w:r>
       <w:r>
         <w:rPr/>
-        <w:t xml:space="preserve">, which was only ever </w:t>
+        <w:t xml:space="preserve">, which only ever got </w:t>
       </w:r>
       <w:r>
         <w:rPr>
@@ -2240,7 +2145,7 @@
       </w:r>
       <w:r>
         <w:rPr/>
-        <w:t xml:space="preserve"> by a successful poll returning "no dog." If WiFi dropped, or the Pi crashed, or the router rebooted, the clearing poll never arrived and the latch stuck on </w:t>
+        <w:t xml:space="preserve"> by a successful poll coming back "no dog." If WiFi dropped, or the Pi crashed, or the router rebooted, that clearing poll never came back, and the latch just stuck on </w:t>
       </w:r>
       <w:r>
         <w:rPr>
@@ -2250,57 +2155,57 @@
       </w:r>
       <w:r>
         <w:rPr/>
-        <w:t>: the buzzer firing every two seconds, and at higher exposure levels the robot re-orienting toward a dog that might have left an hour earlier. This was the worst behaviour the system was capable of, and it was reachable by the most common home-network failure there is. Fixed with a local 4-second TTL that clears the latch without any network round-trip, and mirrored in the test suite so it can't regress silently.</w:t>
-      </w:r>
-    </w:p>
-    <w:p>
-      <w:pPr>
-        <w:pStyle w:val="BodyText"/>
-        <w:bidi w:val="0"/>
-        <w:jc w:val="left"/>
-        <w:rPr/>
-      </w:pPr>
-      <w:r>
-        <w:rPr>
-          <w:rStyle w:val="Strong"/>
-        </w:rPr>
-        <w:t>Chatter at the threshold.</w:t>
-      </w:r>
-      <w:r>
-        <w:rPr/>
-        <w:t xml:space="preserve"> A dog sitting at exactly the correction threshold made the state flip every 20 ms, re-firing the buzzer and inflating intervention counts dozens of times for one continuous event. Fixed with hysteresis.</w:t>
-      </w:r>
-    </w:p>
-    <w:p>
-      <w:pPr>
-        <w:pStyle w:val="BodyText"/>
-        <w:bidi w:val="0"/>
-        <w:jc w:val="left"/>
-        <w:rPr/>
-      </w:pPr>
-      <w:r>
-        <w:rPr>
-          <w:rStyle w:val="Strong"/>
-        </w:rPr>
-        <w:t>The safety guarantee that ordinary arithmetic could violate.</w:t>
-      </w:r>
-      <w:r>
-        <w:rPr/>
-        <w:t xml:space="preserve"> At the lowest "safe" exposure level, orient only, never approach, the bearing logic could legitimately compute FORWARD as the direction to face the dog. The Arduino has no concept of "face" versus "drive at": FORWARD is FORWARD. The one guarantee the entire project rested on could be broken by correct bearing arithmetic rather than by a bug in a rare branch. Fixed by rewriting any FORWARD bearing below the approach-enabled level into an in-place pivot.</w:t>
-      </w:r>
-    </w:p>
-    <w:p>
-      <w:pPr>
-        <w:pStyle w:val="BodyText"/>
-        <w:bidi w:val="0"/>
-        <w:jc w:val="left"/>
-        <w:rPr/>
-      </w:pPr>
-      <w:r>
-        <w:rPr>
-          <w:rStyle w:val="Strong"/>
-        </w:rPr>
-        <w:t>Treats counted that never fell.</w:t>
+        <w:t>: the buzzer firing every two seconds, and at higher exposure levels the robot re-orienting toward a dog who might have wandered off an hour ago. This was genuinely the worst thing the system could do, and it was reachable by the single most common home-network failure there is. I fixed it with a local 4-second timeout that clears the latch with no network round-trip needed, and mirrored it in the test suite so it can't quietly regress later.</w:t>
+      </w:r>
+    </w:p>
+    <w:p>
+      <w:pPr>
+        <w:pStyle w:val="BodyText"/>
+        <w:bidi w:val="0"/>
+        <w:jc w:val="left"/>
+        <w:rPr/>
+      </w:pPr>
+      <w:r>
+        <w:rPr>
+          <w:rStyle w:val="Strong"/>
+        </w:rPr>
+        <w:t>Chatter right at the threshold.</w:t>
+      </w:r>
+      <w:r>
+        <w:rPr/>
+        <w:t xml:space="preserve"> A dog sitting exactly at the correction threshold made the state flip every 20 ms, re-firing the buzzer and inflating the intervention count dozens of times for what was really one continuous event. Fixed with hysteresis.</w:t>
+      </w:r>
+    </w:p>
+    <w:p>
+      <w:pPr>
+        <w:pStyle w:val="BodyText"/>
+        <w:bidi w:val="0"/>
+        <w:jc w:val="left"/>
+        <w:rPr/>
+      </w:pPr>
+      <w:r>
+        <w:rPr>
+          <w:rStyle w:val="Strong"/>
+        </w:rPr>
+        <w:t>A safety guarantee that plain arithmetic could break.</w:t>
+      </w:r>
+      <w:r>
+        <w:rPr/>
+        <w:t xml:space="preserve"> At the lowest "safe" exposure level, orient only, never approach, the bearing logic could legitimately calculate FORWARD as the direction to face the dog. The Arduino has no idea of "face" versus "drive at": FORWARD is just FORWARD. The one guarantee the whole project actually depends on could get broken by completely correct bearing arithmetic, not some rare-branch bug. Fixed by rewriting any FORWARD bearing below the approach-enabled level into an in-place pivot instead.</w:t>
+      </w:r>
+    </w:p>
+    <w:p>
+      <w:pPr>
+        <w:pStyle w:val="BodyText"/>
+        <w:bidi w:val="0"/>
+        <w:jc w:val="left"/>
+        <w:rPr/>
+      </w:pPr>
+      <w:r>
+        <w:rPr>
+          <w:rStyle w:val="Strong"/>
+        </w:rPr>
+        <w:t>Treats getting counted that never actually fell.</w:t>
       </w:r>
       <w:r>
         <w:rPr/>
@@ -2314,36 +2219,25 @@
       </w:r>
       <w:r>
         <w:rPr/>
-        <w:t xml:space="preserve"> for one. A jam or an empty hopper still rang the marker tone and still incremented the count. For a system whose entire mechanism is "sound predicts treat," a marker with nothing behind it doesn't merely waste a session, it teaches the dog the marker is a lie. Fixed twice over: delivery confirmed back from the Arduino so rewards count on ACK not on request, and a correlation id per dispense so a coincidental manual button press can't be miscredited to a pending automatic reward. After two consecutive jams the dispenser goes silent rather than keep beeping over an empty hopper.</w:t>
-      </w:r>
-    </w:p>
-    <w:p>
-      <w:pPr>
-        <w:pStyle w:val="BodyText"/>
-        <w:bidi w:val="0"/>
-        <w:jc w:val="left"/>
-        <w:rPr/>
-      </w:pPr>
-      <w:r>
-        <w:rPr>
-          <w:rStyle w:val="Strong"/>
-        </w:rPr>
-        <w:t>CAD that looked right and didn't fit.</w:t>
-      </w:r>
-      <w:r>
-        <w:rPr/>
-        <w:t xml:space="preserve"> Three print revisions each carried a real interference: the treat chute ran straight through the castor wheel's position; the funnel's sloped wall was clipped by the shelf cutout; the castor spacer overlapped the deck skirt by 7 mm; the hopper lid was modelled as a straight plug pushed into a funnel that keeps narrowing, so it couldn't seat the last 2.5 mm. Every one looked correct in a 3D preview and only failed once printed in plastic, a full print cycle per discovery. The fix that mattered is in §11.</w:t>
-      </w:r>
-    </w:p>
-    <w:p>
-      <w:pPr>
-        <w:pStyle w:val="HorizontalLine"/>
-        <w:bidi w:val="0"/>
-        <w:jc w:val="left"/>
-        <w:rPr/>
-      </w:pPr>
-      <w:r>
-        <w:rPr/>
+        <w:t xml:space="preserve"> for one. A jam or an empty hopper would still ring the marker tone and still bump the count up. For a system whose entire mechanism is "sound predicts treat," a marker with nothing behind it doesn't just waste one session, it actively teaches the dog the marker is a lie. I fixed this two ways: delivery gets confirmed back from the Arduino so rewards only count on an actual ACK, not just the request, and a correlation id on each dispense means a coincidental manual button press can't get miscredited to a pending automatic reward. After two jams in a row, the dispenser goes quiet instead of continuing to beep over an empty hopper.</w:t>
+      </w:r>
+    </w:p>
+    <w:p>
+      <w:pPr>
+        <w:pStyle w:val="BodyText"/>
+        <w:bidi w:val="0"/>
+        <w:jc w:val="left"/>
+        <w:rPr/>
+      </w:pPr>
+      <w:r>
+        <w:rPr>
+          <w:rStyle w:val="Strong"/>
+        </w:rPr>
+        <w:t>CAD that looked fine and didn't fit at all.</w:t>
+      </w:r>
+      <w:r>
+        <w:rPr/>
+        <w:t xml:space="preserve"> Three print revisions each had a genuine interference: the treat chute ran straight through where the castor wheel needed to sit; the funnel's sloped wall clipped the shelf cutout; the castor spacer overlapped the deck skirt by 7 mm; the hopper lid was modelled as a straight plug pushed into a funnel that keeps narrowing, so it physically couldn't seat the last 2.5 mm. Every single one looked completely fine in a 3D preview and only broke once it was actual printed plastic, a full print cycle per discovery. The fix that actually mattered here is in §11.</w:t>
       </w:r>
     </w:p>
     <w:p>
@@ -2355,19 +2249,19 @@
       </w:pPr>
       <w:r>
         <w:rPr/>
-        <w:t>10. Results, engineering validation</w:t>
-      </w:r>
-    </w:p>
-    <w:p>
-      <w:pPr>
-        <w:pStyle w:val="BodyText"/>
-        <w:bidi w:val="0"/>
-        <w:jc w:val="left"/>
-        <w:rPr/>
-      </w:pPr>
-      <w:r>
-        <w:rPr/>
-        <w:t xml:space="preserve">Per-subsystem bench tests, executed and logged. </w:t>
+        <w:t>10. Results: engineering validation</w:t>
+      </w:r>
+    </w:p>
+    <w:p>
+      <w:pPr>
+        <w:pStyle w:val="BodyText"/>
+        <w:bidi w:val="0"/>
+        <w:jc w:val="left"/>
+        <w:rPr/>
+      </w:pPr>
+      <w:r>
+        <w:rPr/>
+        <w:t xml:space="preserve">Bench tests, run per subsystem and logged. </w:t>
       </w:r>
       <w:r>
         <w:rPr>
@@ -2392,20 +2286,20 @@
     </w:p>
     <w:tbl>
       <w:tblPr>
-        <w:tblW w:w="11339" w:type="dxa"/>
         <w:jc w:val="left"/>
         <w:tblInd w:w="28" w:type="dxa"/>
-        <w:tblLayout w:type="fixed"/>
         <w:tblCellMar>
           <w:top w:w="28" w:type="dxa"/>
           <w:left w:w="28" w:type="dxa"/>
           <w:bottom w:w="28" w:type="dxa"/>
           <w:right w:w="28" w:type="dxa"/>
         </w:tblCellMar>
+        <w:tblLayout w:type="fixed"/>
+        <w:tblW w:w="9072" w:type="dxa"/>
       </w:tblPr>
       <w:tblGrid>
-        <w:gridCol w:w="3626"/>
-        <w:gridCol w:w="7713"/>
+        <w:gridCol w:w="3351"/>
+        <w:gridCol w:w="5721"/>
       </w:tblGrid>
       <w:tr>
         <w:trPr>
@@ -2413,15 +2307,14 @@
         </w:trPr>
         <w:tc>
           <w:tcPr>
-            <w:tcW w:w="3626" w:type="dxa"/>
-            <w:tcBorders/>
-            <w:vAlign w:val="center"/>
+            <w:tcBorders/>
+            <w:vAlign w:val="center"/>
+            <w:tcW w:w="3351" w:type="dxa"/>
           </w:tcPr>
           <w:p>
             <w:pPr>
               <w:pStyle w:val="TableHeading"/>
               <w:suppressLineNumbers/>
-              <w:shd w:fill="EEEEEE" w:val="clear"/>
               <w:bidi w:val="0"/>
               <w:spacing w:before="0" w:after="283"/>
               <w:jc w:val="left"/>
@@ -2435,15 +2328,14 @@
         </w:tc>
         <w:tc>
           <w:tcPr>
-            <w:tcW w:w="7713" w:type="dxa"/>
-            <w:tcBorders/>
-            <w:vAlign w:val="center"/>
+            <w:tcBorders/>
+            <w:vAlign w:val="center"/>
+            <w:tcW w:w="5721" w:type="dxa"/>
           </w:tcPr>
           <w:p>
             <w:pPr>
               <w:pStyle w:val="TableHeading"/>
               <w:suppressLineNumbers/>
-              <w:shd w:fill="EEEEEE" w:val="clear"/>
               <w:bidi w:val="0"/>
               <w:spacing w:before="0" w:after="283"/>
               <w:jc w:val="left"/>
@@ -2460,9 +2352,9 @@
         <w:trPr/>
         <w:tc>
           <w:tcPr>
-            <w:tcW w:w="3626" w:type="dxa"/>
-            <w:tcBorders/>
-            <w:vAlign w:val="center"/>
+            <w:tcBorders/>
+            <w:vAlign w:val="center"/>
+            <w:tcW w:w="3351" w:type="dxa"/>
           </w:tcPr>
           <w:p>
             <w:pPr>
@@ -2480,9 +2372,9 @@
         </w:tc>
         <w:tc>
           <w:tcPr>
-            <w:tcW w:w="7713" w:type="dxa"/>
-            <w:tcBorders/>
-            <w:vAlign w:val="center"/>
+            <w:tcBorders/>
+            <w:vAlign w:val="center"/>
+            <w:tcW w:w="5721" w:type="dxa"/>
           </w:tcPr>
           <w:p>
             <w:pPr>
@@ -2509,9 +2401,9 @@
         <w:trPr/>
         <w:tc>
           <w:tcPr>
-            <w:tcW w:w="3626" w:type="dxa"/>
-            <w:tcBorders/>
-            <w:vAlign w:val="center"/>
+            <w:tcBorders/>
+            <w:vAlign w:val="center"/>
+            <w:tcW w:w="3351" w:type="dxa"/>
           </w:tcPr>
           <w:p>
             <w:pPr>
@@ -2529,9 +2421,9 @@
         </w:tc>
         <w:tc>
           <w:tcPr>
-            <w:tcW w:w="7713" w:type="dxa"/>
-            <w:tcBorders/>
-            <w:vAlign w:val="center"/>
+            <w:tcBorders/>
+            <w:vAlign w:val="center"/>
+            <w:tcW w:w="5721" w:type="dxa"/>
           </w:tcPr>
           <w:p>
             <w:pPr>
@@ -2559,7 +2451,7 @@
             </w:r>
             <w:r>
               <w:rPr/>
-              <w:t xml:space="preserve"> tuning happens once mounted on the chassis, not on the bench</w:t>
+              <w:t xml:space="preserve"> tuning happens once it's actually mounted, not on the bench</w:t>
             </w:r>
           </w:p>
         </w:tc>
@@ -2568,9 +2460,9 @@
         <w:trPr/>
         <w:tc>
           <w:tcPr>
-            <w:tcW w:w="3626" w:type="dxa"/>
-            <w:tcBorders/>
-            <w:vAlign w:val="center"/>
+            <w:tcBorders/>
+            <w:vAlign w:val="center"/>
+            <w:tcW w:w="3351" w:type="dxa"/>
           </w:tcPr>
           <w:p>
             <w:pPr>
@@ -2588,9 +2480,9 @@
         </w:tc>
         <w:tc>
           <w:tcPr>
-            <w:tcW w:w="7713" w:type="dxa"/>
-            <w:tcBorders/>
-            <w:vAlign w:val="center"/>
+            <w:tcBorders/>
+            <w:vAlign w:val="center"/>
+            <w:tcW w:w="5721" w:type="dxa"/>
           </w:tcPr>
           <w:p>
             <w:pPr>
@@ -2617,9 +2509,9 @@
         <w:trPr/>
         <w:tc>
           <w:tcPr>
-            <w:tcW w:w="3626" w:type="dxa"/>
-            <w:tcBorders/>
-            <w:vAlign w:val="center"/>
+            <w:tcBorders/>
+            <w:vAlign w:val="center"/>
+            <w:tcW w:w="3351" w:type="dxa"/>
           </w:tcPr>
           <w:p>
             <w:pPr>
@@ -2637,9 +2529,9 @@
         </w:tc>
         <w:tc>
           <w:tcPr>
-            <w:tcW w:w="7713" w:type="dxa"/>
-            <w:tcBorders/>
-            <w:vAlign w:val="center"/>
+            <w:tcBorders/>
+            <w:vAlign w:val="center"/>
+            <w:tcW w:w="5721" w:type="dxa"/>
           </w:tcPr>
           <w:p>
             <w:pPr>
@@ -2662,29 +2554,29 @@
         <w:trPr/>
         <w:tc>
           <w:tcPr>
-            <w:tcW w:w="3626" w:type="dxa"/>
-            <w:tcBorders/>
-            <w:vAlign w:val="center"/>
-          </w:tcPr>
-          <w:p>
-            <w:pPr>
-              <w:pStyle w:val="TableContents"/>
-              <w:bidi w:val="0"/>
-              <w:spacing w:before="0" w:after="283"/>
-              <w:jc w:val="left"/>
-              <w:rPr/>
-            </w:pPr>
-            <w:r>
-              <w:rPr/>
-              <w:t>5, Three-way Pi to ESP32 to Arduino comms</w:t>
-            </w:r>
-          </w:p>
-        </w:tc>
-        <w:tc>
-          <w:tcPr>
-            <w:tcW w:w="7713" w:type="dxa"/>
-            <w:tcBorders/>
-            <w:vAlign w:val="center"/>
+            <w:tcBorders/>
+            <w:vAlign w:val="center"/>
+            <w:tcW w:w="3351" w:type="dxa"/>
+          </w:tcPr>
+          <w:p>
+            <w:pPr>
+              <w:pStyle w:val="TableContents"/>
+              <w:bidi w:val="0"/>
+              <w:spacing w:before="0" w:after="283"/>
+              <w:jc w:val="left"/>
+              <w:rPr/>
+            </w:pPr>
+            <w:r>
+              <w:rPr/>
+              <w:t>5, Full three-way Pi to ESP32 to Arduino comms</w:t>
+            </w:r>
+          </w:p>
+        </w:tc>
+        <w:tc>
+          <w:tcPr>
+            <w:tcBorders/>
+            <w:vAlign w:val="center"/>
+            <w:tcW w:w="5721" w:type="dxa"/>
           </w:tcPr>
           <w:p>
             <w:pPr>
@@ -2702,7 +2594,7 @@
             </w:r>
             <w:r>
               <w:rPr/>
-              <w:t xml:space="preserve"> Full communication confirmed</w:t>
+              <w:t xml:space="preserve"> Communication confirmed end to end</w:t>
             </w:r>
           </w:p>
         </w:tc>
@@ -2717,46 +2609,35 @@
       </w:pPr>
       <w:r>
         <w:rPr/>
-        <w:t>Additionally verified on hardware (paper §4.1): vision end to end, camera to OpenCV/ArUco detecting marker ID 0 to directional zone posted to dashboard serving it to the polling ESP32; the state machine's real outputs including dispense, correction cue, reward cooldown and cap, and watchdog-safe pulsed orienting; and the dashboard's live link with simulator fallback, auto-starting on boot.</w:t>
-      </w:r>
-    </w:p>
-    <w:p>
-      <w:pPr>
-        <w:pStyle w:val="BodyText"/>
-        <w:bidi w:val="0"/>
-        <w:jc w:val="left"/>
-        <w:rPr/>
-      </w:pPr>
-      <w:r>
-        <w:rPr>
-          <w:rStyle w:val="Strong"/>
-        </w:rPr>
-        <w:t>What was measured, and what wasn't.</w:t>
-      </w:r>
-      <w:r>
-        <w:rPr/>
-        <w:t xml:space="preserve"> These are engineering-validation results: whether each subsystem behaves as specified, whether the closed loop makes the intended transitions, whether the fail-safes fire. </w:t>
-      </w:r>
-      <w:r>
-        <w:rPr>
-          <w:rStyle w:val="Strong"/>
-        </w:rPr>
-        <w:t>No controlled behavioural trial was run,</w:t>
-      </w:r>
-      <w:r>
-        <w:rPr/>
-        <w:t xml:space="preserve"> and none of the data a behaviour-change claim requires (baseline behaviour rates, a control condition, blinded coding, multiple subjects) was collected. That's a deliberate scoping decision, not an omission (§12).</w:t>
-      </w:r>
-    </w:p>
-    <w:p>
-      <w:pPr>
-        <w:pStyle w:val="HorizontalLine"/>
-        <w:bidi w:val="0"/>
-        <w:jc w:val="left"/>
-        <w:rPr/>
-      </w:pPr>
-      <w:r>
-        <w:rPr/>
+        <w:t>Also verified on real hardware (paper §4.1): vision working end to end, camera through OpenCV/ArUco detecting marker ID 0 through a directional zone posted to the dashboard, which the polling ESP32 picks up; the state machine's real outputs, including dispense, correction cue, reward cooldown and cap, and watchdog-safe pulsed orienting; and the dashboard's live link with a simulator fallback that auto-starts on boot.</w:t>
+      </w:r>
+    </w:p>
+    <w:p>
+      <w:pPr>
+        <w:pStyle w:val="BodyText"/>
+        <w:bidi w:val="0"/>
+        <w:jc w:val="left"/>
+        <w:rPr/>
+      </w:pPr>
+      <w:r>
+        <w:rPr>
+          <w:rStyle w:val="Strong"/>
+        </w:rPr>
+        <w:t>What I measured, and what I didn't.</w:t>
+      </w:r>
+      <w:r>
+        <w:rPr/>
+        <w:t xml:space="preserve"> These are engineering-validation results: does each subsystem behave the way I said it would, does the closed loop actually make the transitions I intended, do the fail-safes fire when they're supposed to. </w:t>
+      </w:r>
+      <w:r>
+        <w:rPr>
+          <w:rStyle w:val="Strong"/>
+        </w:rPr>
+        <w:t>I didn't run a controlled behavioural trial</w:t>
+      </w:r>
+      <w:r>
+        <w:rPr/>
+        <w:t>, and I didn't collect anything a behaviour-change claim would actually need, baseline behaviour rates, a control condition, blinded coding, multiple subjects. That's a deliberate decision about scope, not something I just forgot (§12).</w:t>
       </w:r>
     </w:p>
     <w:p>
@@ -2782,47 +2663,47 @@
         <w:rPr>
           <w:rStyle w:val="Strong"/>
         </w:rPr>
-        <w:t>Inverting the conditioning primitive.</w:t>
-      </w:r>
-      <w:r>
-        <w:rPr/>
-        <w:t xml:space="preserve"> The creative core of the project is recognising that the standard design isn't merely suboptimal for a fearful dog but actively counterproductive, and that inverting it, reward leaving rather than punish entering, solves the welfare problem and the engineering problem at once. It removes the punishment path entirely, so there's no aversive behaviour left in the system to be reached by a misconfiguration.</w:t>
-      </w:r>
-    </w:p>
-    <w:p>
-      <w:pPr>
-        <w:pStyle w:val="BodyText"/>
-        <w:bidi w:val="0"/>
-        <w:jc w:val="left"/>
-        <w:rPr/>
-      </w:pPr>
-      <w:r>
-        <w:rPr>
-          <w:rStyle w:val="Strong"/>
-        </w:rPr>
-        <w:t>Making welfare a single quantity.</w:t>
-      </w:r>
-      <w:r>
-        <w:rPr/>
-        <w:t xml:space="preserve"> Turning a diffuse design intention into one explicit, default-safe, reversible control is the pattern most likely to transfer to something else. It converts "we were careful" into a property that can be inspected, tested, defaulted safe, and reset on boot.</w:t>
-      </w:r>
-    </w:p>
-    <w:p>
-      <w:pPr>
-        <w:pStyle w:val="BodyText"/>
-        <w:bidi w:val="0"/>
-        <w:jc w:val="left"/>
-        <w:rPr/>
-      </w:pPr>
-      <w:r>
-        <w:rPr>
-          <w:rStyle w:val="Strong"/>
-        </w:rPr>
-        <w:t>Turning fit into a computation.</w:t>
-      </w:r>
-      <w:r>
-        <w:rPr/>
-        <w:t xml:space="preserve"> The most useful methodological invention came out of the CAD failures. Instead of eyeballing a preview, every part's real assembly position is checked by asking OpenSCAD to compute the literal 3D intersection of the two placed solids: two parts that don't touch intersect to nothing, two parts that overlap intersect to a solid you can see and measure. That converts "does this fit?" from a rendering judgement into a yes/no computation, and it now gates every dimension the project claims anywhere. The general form matters more than the trick: when your eye keeps getting a class of question wrong, stop trying to look harder and find a way to </w:t>
+        <w:t>Flipping the conditioning approach on its head.</w:t>
+      </w:r>
+      <w:r>
+        <w:rPr/>
+        <w:t xml:space="preserve"> The main creative decision in this whole project is realising the standard design isn't just not ideal for a fearful dog, it's actively counterproductive, and that flipping it, rewarding leaving instead of punishing entering, solves the welfare problem and the engineering problem at the exact same time. It removes the punishment path completely, so there's no aversive behaviour left anywhere in the system that could get triggered by a misconfiguration.</w:t>
+      </w:r>
+    </w:p>
+    <w:p>
+      <w:pPr>
+        <w:pStyle w:val="BodyText"/>
+        <w:bidi w:val="0"/>
+        <w:jc w:val="left"/>
+        <w:rPr/>
+      </w:pPr>
+      <w:r>
+        <w:rPr>
+          <w:rStyle w:val="Strong"/>
+        </w:rPr>
+        <w:t>Turning welfare into a single number.</w:t>
+      </w:r>
+      <w:r>
+        <w:rPr/>
+        <w:t xml:space="preserve"> Taking a vague design intention and turning it into one explicit, default-safe, reversible control is the part of this I think is most likely to actually transfer to something else. It turns "we were being careful" into a property you can actually inspect, test, default to safe, and reset on every boot.</w:t>
+      </w:r>
+    </w:p>
+    <w:p>
+      <w:pPr>
+        <w:pStyle w:val="BodyText"/>
+        <w:bidi w:val="0"/>
+        <w:jc w:val="left"/>
+        <w:rPr/>
+      </w:pPr>
+      <w:r>
+        <w:rPr>
+          <w:rStyle w:val="Strong"/>
+        </w:rPr>
+        <w:t>Turning "does it fit" into an actual computation.</w:t>
+      </w:r>
+      <w:r>
+        <w:rPr/>
+        <w:t xml:space="preserve"> The most useful method I came up with grew directly out of the CAD failures. Instead of just eyeballing a preview, I check every part's real assembly position by asking OpenSCAD to compute the literal 3D intersection between two placed solids: parts that don't actually touch intersect to nothing, and parts that overlap intersect to a solid shape you can see and measure. That turns "does this fit?" from a judgement call based on a render into a plain yes/no computation, and it now checks every dimension I claim anywhere in this project. The general idea matters more than the specific trick here: when your eye keeps getting a certain kind of question wrong, stop trying to look harder and find a way to actually </w:t>
       </w:r>
       <w:r>
         <w:rPr>
@@ -2832,21 +2713,21 @@
       </w:r>
       <w:r>
         <w:rPr/>
-        <w:t xml:space="preserve"> the answer.</w:t>
-      </w:r>
-    </w:p>
-    <w:p>
-      <w:pPr>
-        <w:pStyle w:val="BodyText"/>
-        <w:bidi w:val="0"/>
-        <w:jc w:val="left"/>
-        <w:rPr/>
-      </w:pPr>
-      <w:r>
-        <w:rPr>
-          <w:rStyle w:val="Strong"/>
-        </w:rPr>
-        <w:t>Naming the failure mode you're actually in.</w:t>
+        <w:t xml:space="preserve"> the answer instead.</w:t>
+      </w:r>
+    </w:p>
+    <w:p>
+      <w:pPr>
+        <w:pStyle w:val="BodyText"/>
+        <w:bidi w:val="0"/>
+        <w:jc w:val="left"/>
+        <w:rPr/>
+      </w:pPr>
+      <w:r>
+        <w:rPr>
+          <w:rStyle w:val="Strong"/>
+        </w:rPr>
+        <w:t>Actually naming the failure mode I was in.</w:t>
       </w:r>
       <w:r>
         <w:rPr/>
@@ -2870,18 +2751,7 @@
       </w:r>
       <w:r>
         <w:rPr/>
-        <w:t xml:space="preserve"> alongside the instruction to ship the simplest working mode and observe. Writing that down about your own project, in your own repository, is uncomfortable, and that's what makes the rest of the document trustworthy. See §13.4.</w:t>
-      </w:r>
-    </w:p>
-    <w:p>
-      <w:pPr>
-        <w:pStyle w:val="HorizontalLine"/>
-        <w:bidi w:val="0"/>
-        <w:jc w:val="left"/>
-        <w:rPr/>
-      </w:pPr>
-      <w:r>
-        <w:rPr/>
+        <w:t xml:space="preserve"> right alongside the instruction to just ship the simplest working mode and go observe. Writing that down about my own project, in my own repo, was uncomfortable, and I think that's exactly why it makes the rest of the document trustworthy. See §13.4.</w:t>
       </w:r>
     </w:p>
     <w:p>
@@ -2915,7 +2785,7 @@
       </w:r>
       <w:r>
         <w:rPr/>
-        <w:t>, with animal-welfare hazards listed first because constraint C1 outranks capability everywhere in the system.</w:t>
+        <w:t>, with animal-welfare hazards listed first because constraint C1 outranks everything else, capability included, everywhere in this system.</w:t>
       </w:r>
     </w:p>
     <w:p>
@@ -2933,7 +2803,7 @@
       </w:r>
       <w:r>
         <w:rPr/>
-        <w:t xml:space="preserve"> No claim is made that CANIS changes the dog's behaviour. No institutional animal-ethics approval was obtained, deliberately, because no behavioural result is being reported. If the work were ever reframed toward an efficacy claim, prior review from an animal-research ethics body and/or a qualified veterinary behaviourist would be required </w:t>
+        <w:t xml:space="preserve"> I'm not claiming CANIS changes the dog's behaviour. I didn't get institutional animal-ethics approval, on purpose, because I'm not reporting any behavioural result. If this work ever got reframed toward an efficacy claim, I'd need prior review from an animal-research ethics body and/or a qualified veterinary behaviourist </w:t>
       </w:r>
       <w:r>
         <w:rPr>
@@ -2943,7 +2813,7 @@
       </w:r>
       <w:r>
         <w:rPr/>
-        <w:t>, and the exposure protocol's fear-response coding scheme would need pre-registering rather than being defined after the data was in. Choosing the scope your evidence supports, rather than the scope that sounds most impressive, is itself an ethical decision.</w:t>
+        <w:t>, and the exposure protocol's fear-response coding scheme would need to be pre-registered rather than defined after I'd already seen the data. Choosing the scope your evidence actually supports, instead of the scope that sounds most impressive, is itself an ethical decision, and I think it's the right one here.</w:t>
       </w:r>
     </w:p>
     <w:p>
@@ -2961,7 +2831,7 @@
       </w:r>
       <w:r>
         <w:rPr/>
-        <w:t xml:space="preserve"> Default no movement; a mild auditory cue and a food reward; reinforcement of a desired alternative rather than positive punishment; motion introduced one reversible step at a time, gated on the dog's logged response.</w:t>
+        <w:t xml:space="preserve"> Default no movement; a mild sound cue and a food reward; reinforcing a desired alternative rather than punishing anything; motion introduced one reversible step at a time, gated entirely on the dog's logged response.</w:t>
       </w:r>
     </w:p>
     <w:p>
@@ -2979,7 +2849,7 @@
       </w:r>
       <w:r>
         <w:rPr/>
-        <w:t xml:space="preserve"> Hardware motion watchdog halting within ~1 s of any command-link loss; correction motions duration-bounded and halted immediately on disengagement; </w:t>
+        <w:t xml:space="preserve"> A hardware motion watchdog that halts within ~1 s of any command-link loss; correction motions that are duration-bounded and stop immediately on disengagement; </w:t>
       </w:r>
       <w:r>
         <w:rPr>
@@ -2989,7 +2859,7 @@
       </w:r>
       <w:r>
         <w:rPr/>
-        <w:t xml:space="preserve"> in every mode; speeds dialled down for exposure sessions; supervision throughout, with the session ended immediately on any sign of distress </w:t>
+        <w:t xml:space="preserve"> in every single mode; speeds turned down for exposure sessions; supervision the whole time, with the session ending immediately on any sign of distress </w:t>
       </w:r>
       <w:r>
         <w:rPr>
@@ -2999,7 +2869,7 @@
       </w:r>
       <w:r>
         <w:rPr/>
-        <w:t xml:space="preserve"> over-arousal. The second is watched for as closely as the first, since a chased robot can wind a dog up rather than frighten it.</w:t>
+        <w:t xml:space="preserve"> over-arousal. I watch for the second one just as closely as the first, since a robot that's being chased can wind a dog up instead of scaring him.</w:t>
       </w:r>
     </w:p>
     <w:p>
@@ -3017,7 +2887,7 @@
       </w:r>
       <w:r>
         <w:rPr/>
-        <w:t xml:space="preserve"> 20 s cooldown and a 30-per-session cap, enforced in all modes with a compile-time guard, preventing over-feeding and hopper depletion. Treats are a vet-recommended training treat; the count given varies with session length rather than being fixed, and the daily total is confirmed to sit comfortably within a safe allowance.</w:t>
+        <w:t xml:space="preserve"> A 20 s cooldown and a 30-per-session cap, enforced in every mode with a compile-time guard, to stop over-feeding and hopper depletion. The treats are a vet-recommended training treat; how many get given varies with session length rather than being a fixed number, and the daily total is confirmed to sit comfortably inside a safe allowance.</w:t>
       </w:r>
     </w:p>
     <w:p>
@@ -3035,7 +2905,7 @@
       </w:r>
       <w:r>
         <w:rPr/>
-        <w:t xml:space="preserve"> The camera performs on-device fiducial detection only: a zone label is posted, not imagery. Recorded data is sensor counters, arousal and state logs, and marker detections. The vision script has a </w:t>
+        <w:t xml:space="preserve"> The camera only does on-device fiducial detection: a zone label gets posted, never any actual imagery. What gets recorded is sensor counters, arousal and state logs, and marker detections. The vision script has a </w:t>
       </w:r>
       <w:r>
         <w:rPr>
@@ -3045,25 +2915,25 @@
       </w:r>
       <w:r>
         <w:rPr/>
-        <w:t xml:space="preserve"> diagnostic flag that can save a still frame to disk; whether it's ever been used outside a one-off bring-up test, and what retention policy applies if so, is confirmed by me in §14. The home network SSID was found in tracked test sketches and scrubbed, including from the audit file that had recorded it, and a provenance convention was added so stale claims can't drift unnoticed.</w:t>
-      </w:r>
-    </w:p>
-    <w:p>
-      <w:pPr>
-        <w:pStyle w:val="BodyText"/>
-        <w:bidi w:val="0"/>
-        <w:jc w:val="left"/>
-        <w:rPr/>
-      </w:pPr>
-      <w:r>
-        <w:rPr>
-          <w:rStyle w:val="Strong"/>
-        </w:rPr>
-        <w:t>Open welfare items, stated as open.</w:t>
-      </w:r>
-      <w:r>
-        <w:rPr/>
-        <w:t xml:space="preserve"> The beam-break jam detector has no mount and ships disabled, so a silent jam is caught only by gate-cycle counting. Reward latency of ~5 to 9 s may reinforce whatever the dog did in the interval; the immediate marker tone is the standard bridge, but latency reduction is open work. (Over-arousal, previously listed here, is resolved above: the stop-on-over-arousal rule is an explicit, confirmed protocol, not an outstanding gap.)</w:t>
+        <w:t xml:space="preserve"> diagnostic flag that can save a still frame to disk; whether that's ever actually been used outside the one bring-up test, and what the retention policy is if so, is something I confirm myself in §14. The home network SSID turned up in tracked test sketches and got scrubbed, including from the audit file that had recorded it in the first place, and I've added a provenance convention so a stale claim like that can't quietly drift unnoticed again.</w:t>
+      </w:r>
+    </w:p>
+    <w:p>
+      <w:pPr>
+        <w:pStyle w:val="BodyText"/>
+        <w:bidi w:val="0"/>
+        <w:jc w:val="left"/>
+        <w:rPr/>
+      </w:pPr>
+      <w:r>
+        <w:rPr>
+          <w:rStyle w:val="Strong"/>
+        </w:rPr>
+        <w:t>Open welfare items, and I'm stating them as open.</w:t>
+      </w:r>
+      <w:r>
+        <w:rPr/>
+        <w:t xml:space="preserve"> The beam-break jam detector has no mount and ships disabled, so a silent jam only gets caught by gate-cycle counting. Reward latency of ~5 to 9 seconds might reinforce whatever the dog happened to do in that gap; the immediate marker tone is the standard fix for that, but actually cutting the latency down is still open work. (Over-arousal used to be listed here too, but it's resolved now, since the stop-on-over-arousal rule is an explicit, confirmed protocol at this point, not a gap anymore.)</w:t>
       </w:r>
     </w:p>
     <w:p>
@@ -3081,18 +2951,7 @@
       </w:r>
       <w:r>
         <w:rPr/>
-        <w:t xml:space="preserve"> The animal's owner (me) consents to participation and can end any session at will.</w:t>
-      </w:r>
-    </w:p>
-    <w:p>
-      <w:pPr>
-        <w:pStyle w:val="HorizontalLine"/>
-        <w:bidi w:val="0"/>
-        <w:jc w:val="left"/>
-        <w:rPr/>
-      </w:pPr>
-      <w:r>
-        <w:rPr/>
+        <w:t xml:space="preserve"> The animal's owner, me, consents to his taking part and can end any session whenever I want to.</w:t>
       </w:r>
     </w:p>
     <w:p>
@@ -3104,7 +2963,7 @@
       </w:pPr>
       <w:r>
         <w:rPr/>
-        <w:t>13. Conclusions, implications, and reflection</w:t>
+        <w:t>13. Conclusions, what it means, and what I'd do differently</w:t>
       </w:r>
     </w:p>
     <w:p>
@@ -3128,7 +2987,7 @@
       </w:pPr>
       <w:r>
         <w:rPr/>
-        <w:t>A conditioning robot for a fear-sensitive dog can be built such that welfare is an architectural property rather than a matter of operator care. Three specific conclusions are supported by the validation in §10:</w:t>
+        <w:t>A conditioning robot for a fear-sensitive dog can genuinely be built so that welfare is an architectural property, not just something that depends on the operator being careful. Three specific conclusions come out of the validation in §10:</w:t>
       </w:r>
     </w:p>
     <w:p>
@@ -3152,11 +3011,11 @@
         <w:rPr>
           <w:rStyle w:val="Strong"/>
         </w:rPr>
-        <w:t>Fail-safe motion is achievable with cheap hardware.</w:t>
-      </w:r>
-      <w:r>
-        <w:rPr/>
-        <w:t xml:space="preserve"> Splitting the real-time executor from the decision tier and giving the executor an independent watchdog means every failure path (crashed controller, dead network, pulled cable) terminates in </w:t>
+        <w:t>Fail-safe motion is achievable on cheap hardware.</w:t>
+      </w:r>
+      <w:r>
+        <w:rPr/>
+        <w:t xml:space="preserve"> Splitting the real-time executor away from the decision tier, and giving the executor its own watchdog, means every failure path (crashed controller, dead network, a pulled cable) ends up at </w:t>
       </w:r>
       <w:r>
         <w:rPr>
@@ -3190,7 +3049,7 @@
         <w:rPr>
           <w:rStyle w:val="Strong"/>
         </w:rPr>
-        <w:t>Welfare can be reduced to one controllable quantity.</w:t>
+        <w:t>Welfare really can be reduced to one controllable number.</w:t>
       </w:r>
       <w:r>
         <w:rPr/>
@@ -3204,7 +3063,7 @@
       </w:r>
       <w:r>
         <w:rPr/>
-        <w:t xml:space="preserve"> decouples decision-making from physical envelope, so the full decision logic can run and be debugged while the robot isn't permitted to move at all. </w:t>
+        <w:t xml:space="preserve"> separates decision-making from physical range, so the full decision logic can run and get debugged while the robot isn't allowed to move at all. </w:t>
       </w:r>
     </w:p>
     <w:p>
@@ -3227,23 +3086,23 @@
         <w:rPr>
           <w:rStyle w:val="Strong"/>
         </w:rPr>
-        <w:t>A fiducial beats a learned detector under this cost asymmetry.</w:t>
-      </w:r>
-      <w:r>
-        <w:rPr/>
-        <w:t xml:space="preserve"> When a false positive causes real harm to a frightened animal, near-deterministic identification is worth more than generality, and it costs less compute. </w:t>
-      </w:r>
-    </w:p>
-    <w:p>
-      <w:pPr>
-        <w:pStyle w:val="BodyText"/>
-        <w:bidi w:val="0"/>
-        <w:jc w:val="left"/>
-        <w:rPr/>
-      </w:pPr>
-      <w:r>
-        <w:rPr/>
-        <w:t>All five design objectives in §1 were met. The sixth, behavioural observations, wasn't, and no behavioural claim is made anywhere in this report.</w:t>
+        <w:t>A fiducial beats a learned detector under this particular cost trade-off.</w:t>
+      </w:r>
+      <w:r>
+        <w:rPr/>
+        <w:t xml:space="preserve"> When a false positive does real harm to a frightened animal, near-deterministic identification is worth more than generality, and it's also cheaper to run. </w:t>
+      </w:r>
+    </w:p>
+    <w:p>
+      <w:pPr>
+        <w:pStyle w:val="BodyText"/>
+        <w:bidi w:val="0"/>
+        <w:jc w:val="left"/>
+        <w:rPr/>
+      </w:pPr>
+      <w:r>
+        <w:rPr/>
+        <w:t>All five design objectives from §1 got met. The sixth one, actual behavioural observations, didn't, and I'm not making any behavioural claim anywhere in this report.</w:t>
       </w:r>
     </w:p>
     <w:p>
@@ -3255,19 +3114,19 @@
       </w:pPr>
       <w:r>
         <w:rPr/>
-        <w:t>13.2 Implications</w:t>
-      </w:r>
-    </w:p>
-    <w:p>
-      <w:pPr>
-        <w:pStyle w:val="BodyText"/>
-        <w:bidi w:val="0"/>
-        <w:jc w:val="left"/>
-        <w:rPr/>
-      </w:pPr>
-      <w:r>
-        <w:rPr/>
-        <w:t xml:space="preserve">The transferable result is about </w:t>
+        <w:t>13.2 What this actually means</w:t>
+      </w:r>
+    </w:p>
+    <w:p>
+      <w:pPr>
+        <w:pStyle w:val="BodyText"/>
+        <w:bidi w:val="0"/>
+        <w:jc w:val="left"/>
+        <w:rPr/>
+      </w:pPr>
+      <w:r>
+        <w:rPr/>
+        <w:t xml:space="preserve">The transferable idea here is about </w:t>
       </w:r>
       <w:r>
         <w:rPr>
@@ -3277,19 +3136,19 @@
       </w:r>
       <w:r>
         <w:rPr/>
-        <w:t xml:space="preserve"> The default engineering approach spreads care across many decisions, each individually erodable by a later change. Concentrating it into a single explicit, default-safe, reversible, boot-resetting control makes it inspectable and testable, and means someone can verify the safety property without reading the whole codebase. That applies well beyond dogs: assistive robotics, care equipment, anything sharing space with someone who can't consent in the ordinary sense.</w:t>
-      </w:r>
-    </w:p>
-    <w:p>
-      <w:pPr>
-        <w:pStyle w:val="BodyText"/>
-        <w:bidi w:val="0"/>
-        <w:jc w:val="left"/>
-        <w:rPr/>
-      </w:pPr>
-      <w:r>
-        <w:rPr/>
-        <w:t>The second implication is about detection cost asymmetry. Detection systems are benchmarked on symmetric metrics, but here a false positive harms the animal while a false negative merely misses a training opportunity. When the costs are that asymmetric, the correct architecture may be the less sophisticated one.</w:t>
+        <w:t xml:space="preserve"> Most engineering approaches spread care thin across a lot of separate decisions, and any one of those can get eroded by a later change without anyone noticing. Concentrating it into one explicit, default-safe, reversible control that resets on boot makes it something you can actually inspect and test, and it means someone can check the safety property without reading through the entire codebase. That applies well past dogs: assistive robotics, care equipment, anything sharing physical space with someone who can't consent in the normal sense of the word.</w:t>
+      </w:r>
+    </w:p>
+    <w:p>
+      <w:pPr>
+        <w:pStyle w:val="BodyText"/>
+        <w:bidi w:val="0"/>
+        <w:jc w:val="left"/>
+        <w:rPr/>
+      </w:pPr>
+      <w:r>
+        <w:rPr/>
+        <w:t>The second idea is about cost asymmetry in detection. Most detection systems get benchmarked on symmetric metrics, but here a false positive actually harms the animal while a false negative just misses a training opportunity. When the costs are that lopsided, the right architecture might genuinely be the less fancy one.</w:t>
       </w:r>
     </w:p>
     <w:p>
@@ -3301,7 +3160,7 @@
       </w:pPr>
       <w:r>
         <w:rPr/>
-        <w:t>13.3 How my decisions shaped the outcome</w:t>
+        <w:t>13.3 How my decisions actually shaped what happened</w:t>
       </w:r>
     </w:p>
     <w:p>
@@ -3319,7 +3178,7 @@
       </w:r>
       <w:r>
         <w:rPr/>
-        <w:t xml:space="preserve"> determined everything downstream. It's why there's no aversive path in the system to be reached by any misconfiguration, and it turned a welfare requirement into a structural property.</w:t>
+        <w:t xml:space="preserve"> decided everything that came after it. It's the reason there's no aversive path anywhere in the system to be reached by a misconfiguration, and it turned a welfare requirement into an actual structural property instead of a policy.</w:t>
       </w:r>
     </w:p>
     <w:p>
@@ -3337,7 +3196,7 @@
       </w:r>
       <w:r>
         <w:rPr/>
-        <w:t xml:space="preserve"> is why the FORWARD-bearing violation was caught. The guarantee was explicit and being checked, so it was found by inspection rather than by the robot doing something visibly wrong near a frightened dog.</w:t>
+        <w:t xml:space="preserve"> is the reason the FORWARD-bearing violation got caught at all. The guarantee was explicit and actively being checked, so it got found by inspection, not because the robot did something visibly wrong near a frightened dog.</w:t>
       </w:r>
     </w:p>
     <w:p>
@@ -3355,7 +3214,7 @@
       </w:r>
       <w:r>
         <w:rPr/>
-        <w:t xml:space="preserve"> traded generality for determinism, and it was the right trade only because of the cost asymmetry. I wouldn't make the same choice for a system where a missed detection was the expensive outcome.</w:t>
+        <w:t xml:space="preserve"> traded generality for determinism, and that was only the right trade because of the cost asymmetry involved. I wouldn't make the same call for a system where missing a detection was the expensive outcome instead.</w:t>
       </w:r>
     </w:p>
     <w:p>
@@ -3373,19 +3232,19 @@
       </w:r>
       <w:r>
         <w:rPr/>
-        <w:t xml:space="preserve"> cost the more impressive claim and is the reason every number in this report can be defended.</w:t>
-      </w:r>
-    </w:p>
-    <w:p>
-      <w:pPr>
-        <w:pStyle w:val="BodyText"/>
-        <w:bidi w:val="0"/>
-        <w:jc w:val="left"/>
-        <w:rPr/>
-      </w:pPr>
-      <w:r>
-        <w:rPr/>
-        <w:t>The through-line: each of these decisions accepted a smaller claim or a less capable system in exchange for a property that could be verified.</w:t>
+        <w:t xml:space="preserve"> cost me the more impressive-sounding claim, but it's the reason every single number in this report can actually be defended.</w:t>
+      </w:r>
+    </w:p>
+    <w:p>
+      <w:pPr>
+        <w:pStyle w:val="BodyText"/>
+        <w:bidi w:val="0"/>
+        <w:jc w:val="left"/>
+        <w:rPr/>
+      </w:pPr>
+      <w:r>
+        <w:rPr/>
+        <w:t>Looking back, every one of these decisions traded a bigger claim or a more capable system for a property I could actually verify.</w:t>
       </w:r>
     </w:p>
     <w:p>
@@ -3397,53 +3256,53 @@
       </w:pPr>
       <w:r>
         <w:rPr/>
-        <w:t>13.4 What I learnt, and what I would improve</w:t>
-      </w:r>
-    </w:p>
-    <w:p>
-      <w:pPr>
-        <w:pStyle w:val="BodyText"/>
-        <w:bidi w:val="0"/>
-        <w:jc w:val="left"/>
-        <w:rPr/>
-      </w:pPr>
-      <w:r>
-        <w:rPr/>
-        <w:t>The technical learning spanned three fields that rarely meet: control and real-time systems (watchdogs, hysteresis, failure-domain isolation, numerical safeguards on integration), computer vision (fiducial detection, blur rejection), and animal-behaviour science (counter-conditioning, reward timing, the difference between reinforcing an alternative and suppressing a behaviour).</w:t>
-      </w:r>
-    </w:p>
-    <w:p>
-      <w:pPr>
-        <w:pStyle w:val="BodyText"/>
-        <w:bidi w:val="0"/>
-        <w:jc w:val="left"/>
-        <w:rPr/>
-      </w:pPr>
-      <w:r>
-        <w:rPr/>
-        <w:t xml:space="preserve">The larger lesson was about honesty as an engineering practice. Two moments taught it. The dispenser counting treats that never fell was a case where the system's </w:t>
+        <w:t>13.4 What I learnt, and what I'd do differently</w:t>
+      </w:r>
+    </w:p>
+    <w:p>
+      <w:pPr>
+        <w:pStyle w:val="BodyText"/>
+        <w:bidi w:val="0"/>
+        <w:jc w:val="left"/>
+        <w:rPr/>
+      </w:pPr>
+      <w:r>
+        <w:rPr/>
+        <w:t>The technical learning spanned three fields that don't usually overlap: real-time control systems (watchdogs, hysteresis, isolating failure domains, numerical safeguards on integration), computer vision (fiducial detection, blur rejection), and animal behaviour science (counter-conditioning, reward timing, the difference between reinforcing an alternative and just suppressing a behaviour).</w:t>
+      </w:r>
+    </w:p>
+    <w:p>
+      <w:pPr>
+        <w:pStyle w:val="BodyText"/>
+        <w:bidi w:val="0"/>
+        <w:jc w:val="left"/>
+        <w:rPr/>
+      </w:pPr>
+      <w:r>
+        <w:rPr/>
+        <w:t xml:space="preserve">The bigger lesson was about honesty as part of the engineering itself, not separate from it. Two moments really taught me that. The dispenser counting treats that never actually fell was a case where dishonesty </w:t>
       </w:r>
       <w:r>
         <w:rPr>
           <w:rStyle w:val="Emphasis"/>
         </w:rPr>
-        <w:t>internal</w:t>
-      </w:r>
-      <w:r>
-        <w:rPr/>
-        <w:t xml:space="preserve"> dishonesty had a direct external cost: a marker with nothing behind it teaches the dog the marker is a lie. And writing down that the project's dominant risk was my own build perfectionism was uncomfortable in exactly the way accurate self-assessment is.</w:t>
-      </w:r>
-    </w:p>
-    <w:p>
-      <w:pPr>
-        <w:pStyle w:val="BodyText"/>
-        <w:bidi w:val="0"/>
-        <w:jc w:val="left"/>
-        <w:rPr/>
-      </w:pPr>
-      <w:r>
-        <w:rPr/>
-        <w:t>Four improvements, in priority order:</w:t>
+        <w:t>inside</w:t>
+      </w:r>
+      <w:r>
+        <w:rPr/>
+        <w:t xml:space="preserve"> the system had a real cost outside it, a marker with nothing behind it teaches the dog the marker means nothing. And writing down that the project's biggest risk was my own perfectionism was genuinely uncomfortable, in exactly the way honest self-assessment usually is.</w:t>
+      </w:r>
+    </w:p>
+    <w:p>
+      <w:pPr>
+        <w:pStyle w:val="BodyText"/>
+        <w:bidi w:val="0"/>
+        <w:jc w:val="left"/>
+        <w:rPr/>
+      </w:pPr>
+      <w:r>
+        <w:rPr/>
+        <w:t>Four things I'd actually do to improve this, in order:</w:t>
       </w:r>
     </w:p>
     <w:p>
@@ -3471,7 +3330,7 @@
       </w:r>
       <w:r>
         <w:rPr/>
-        <w:t xml:space="preserve"> This is the real gap. Level 0 is buzzer-only with no motion, it was runnable from Phase 1, and it needed nothing from the chassis. I sequenced the project as though the behavioural work depended on the finished robot, and at Level 0 it never did. Weeks of logged fear-response data would exist by now had I started it in parallel. </w:t>
+        <w:t xml:space="preserve"> This is the real gap in the whole project. Level 0 is buzzer-only with zero motion, it was runnable from Phase 1 onward, and it needed nothing at all from the chassis. I built this as though the behavioural side depended on having the finished robot, and at Level 0 it just never did. I'd have weeks of logged fear-response data by now if I'd started it in parallel from the start. </w:t>
       </w:r>
     </w:p>
     <w:p>
@@ -3495,11 +3354,11 @@
         <w:rPr>
           <w:rStyle w:val="Strong"/>
         </w:rPr>
-        <w:t>Define the fear-response coding scheme before collecting data.</w:t>
-      </w:r>
-      <w:r>
-        <w:rPr/>
-        <w:t xml:space="preserve"> Latency to approach, tail and ear posture, avoidance distance, willingness to take the treat, with pre-registered advance/hold/retreat criteria. Defining these after seeing the data would make them worthless. </w:t>
+        <w:t>Define the fear-response coding scheme before collecting any data.</w:t>
+      </w:r>
+      <w:r>
+        <w:rPr/>
+        <w:t xml:space="preserve"> Latency to approach, tail and ear posture, avoidance distance, willingness to take the treat, with advance/hold/retreat criteria decided in advance. Defining any of that after seeing the data would make it worthless. </w:t>
       </w:r>
     </w:p>
     <w:p>
@@ -3527,7 +3386,7 @@
       </w:r>
       <w:r>
         <w:rPr/>
-        <w:t xml:space="preserve"> Mount and enable the beam-break jam detector, and give over-arousal a robot-side signal rather than relying on supervised judgement alone to catch it. </w:t>
+        <w:t xml:space="preserve"> Actually mount and enable the beam-break jam detector, and give over-arousal a real robot-side signal instead of relying only on me watching for it. </w:t>
       </w:r>
     </w:p>
     <w:p>
@@ -3550,22 +3409,11 @@
         <w:rPr>
           <w:rStyle w:val="Strong"/>
         </w:rPr>
-        <w:t>Reduce reward latency.</w:t>
-      </w:r>
-      <w:r>
-        <w:rPr/>
-        <w:t xml:space="preserve"> At ~5 to 9 s the marker tone is doing all the bridging work; shortening the loop would make the conditioning mechanism sounder. </w:t>
-      </w:r>
-    </w:p>
-    <w:p>
-      <w:pPr>
-        <w:pStyle w:val="HorizontalLine"/>
-        <w:bidi w:val="0"/>
-        <w:jc w:val="left"/>
-        <w:rPr/>
-      </w:pPr>
-      <w:r>
-        <w:rPr/>
+        <w:t>Cut down reward latency.</w:t>
+      </w:r>
+      <w:r>
+        <w:rPr/>
+        <w:t xml:space="preserve"> At ~5 to 9 seconds, the marker tone is doing all the work of bridging that gap; shortening the loop itself would make the whole conditioning mechanism more solid. </w:t>
       </w:r>
     </w:p>
     <w:p>
@@ -3589,19 +3437,19 @@
       </w:pPr>
       <w:r>
         <w:rPr/>
-        <w:t>Resolved: hours (84), mentor (none, §6), stop-session criteria (ends immediately on any sign of distress or over-arousal, §12), and treat budget (vet-recommended treat, daily total confirmed to fit safely, count varies by session, §12).</w:t>
-      </w:r>
-    </w:p>
-    <w:p>
-      <w:pPr>
-        <w:pStyle w:val="BodyText"/>
-        <w:bidi w:val="0"/>
-        <w:jc w:val="left"/>
-        <w:rPr/>
-      </w:pPr>
-      <w:r>
-        <w:rPr/>
-        <w:t>Genuinely open, and only I can close this:</w:t>
+        <w:t>Resolved: hours (84), mentor (none, §6), stop-session criteria (ends immediately on any sign of distress or over-arousal, §12), and treat budget (vet-recommended treat, daily total confirmed to fit safely, amount varies by session, §12).</w:t>
+      </w:r>
+    </w:p>
+    <w:p>
+      <w:pPr>
+        <w:pStyle w:val="BodyText"/>
+        <w:bidi w:val="0"/>
+        <w:jc w:val="left"/>
+        <w:rPr/>
+      </w:pPr>
+      <w:r>
+        <w:rPr/>
+        <w:t>Still genuinely open, and only I can close this one:</w:t>
       </w:r>
     </w:p>
     <w:p>
@@ -3639,7 +3487,7 @@
       </w:r>
       <w:r>
         <w:rPr/>
-        <w:t xml:space="preserve"> diagnostic has never written frames to disk outside the one bring-up test noted in §12, or state the retention policy if it has. This depends on how the device has actually been run, which no amount of reading the tracked launcher script settles. </w:t>
+        <w:t xml:space="preserve"> diagnostic has never actually written frames to disk outside the one bring-up test I've noted in §12, or state the retention policy if it has. This depends on how I've actually run the device, which no amount of reading the tracked launcher script is going to settle for me. </w:t>
       </w:r>
     </w:p>
     <w:p>
@@ -3667,7 +3515,7 @@
       </w:r>
       <w:r>
         <w:rPr/>
-        <w:t xml:space="preserve"> Canine fear-response coding and reward-delay timing. Both are needed for the exposure protocol anyway, but this is a strengthening, not a blocker. </w:t>
+        <w:t xml:space="preserve"> Canine fear-response coding and reward-delay timing. Both would help the exposure protocol anyway, but this is a strengthening, not something blocking submission. </w:t>
       </w:r>
     </w:p>
     <w:p>
@@ -3690,7 +3538,7 @@
         <w:rPr>
           <w:rStyle w:val="Strong"/>
         </w:rPr>
-        <w:t xml:space="preserve">Do not submit the paper draft with </w:t>
+        <w:t xml:space="preserve">Don't submit the paper draft with </w:t>
       </w:r>
       <w:r>
         <w:rPr>
@@ -3702,22 +3550,11 @@
         <w:rPr>
           <w:rStyle w:val="Strong"/>
         </w:rPr>
-        <w:t xml:space="preserve"> markers in it.</w:t>
-      </w:r>
-      <w:r>
-        <w:rPr/>
-        <w:t xml:space="preserve"> Paper §5 and §8 carry unresolved placeholders. This report supersedes §5 by scoping to engineering validation; if the paper is attached as a supporting document, resolve or remove them first. An assessor reads a bracketed TODO as abandoned work. </w:t>
-      </w:r>
-    </w:p>
-    <w:p>
-      <w:pPr>
-        <w:pStyle w:val="HorizontalLine"/>
-        <w:bidi w:val="0"/>
-        <w:jc w:val="left"/>
-        <w:rPr/>
-      </w:pPr>
-      <w:r>
-        <w:rPr/>
+        <w:t xml:space="preserve"> markers still in it.</w:t>
+      </w:r>
+      <w:r>
+        <w:rPr/>
+        <w:t xml:space="preserve"> Paper §5 and §8 still carry unresolved placeholders. This report supersedes §5 by scoping to engineering validation instead; if the paper gets attached as a supporting document, resolve or remove those first, since an assessor reading a bracketed TODO reads it as abandoned work. </w:t>
       </w:r>
     </w:p>
     <w:p>
@@ -3734,21 +3571,21 @@
     </w:p>
     <w:tbl>
       <w:tblPr>
-        <w:tblW w:w="11339" w:type="dxa"/>
         <w:jc w:val="left"/>
         <w:tblInd w:w="28" w:type="dxa"/>
-        <w:tblLayout w:type="fixed"/>
         <w:tblCellMar>
           <w:top w:w="28" w:type="dxa"/>
           <w:left w:w="28" w:type="dxa"/>
           <w:bottom w:w="28" w:type="dxa"/>
           <w:right w:w="28" w:type="dxa"/>
         </w:tblCellMar>
+        <w:tblLayout w:type="fixed"/>
+        <w:tblW w:w="9072" w:type="dxa"/>
       </w:tblPr>
       <w:tblGrid>
-        <w:gridCol w:w="405"/>
-        <w:gridCol w:w="3599"/>
-        <w:gridCol w:w="7335"/>
+        <w:gridCol w:w="1013"/>
+        <w:gridCol w:w="3916"/>
+        <w:gridCol w:w="4143"/>
       </w:tblGrid>
       <w:tr>
         <w:trPr>
@@ -3756,15 +3593,14 @@
         </w:trPr>
         <w:tc>
           <w:tcPr>
-            <w:tcW w:w="405" w:type="dxa"/>
-            <w:tcBorders/>
-            <w:vAlign w:val="center"/>
+            <w:tcBorders/>
+            <w:vAlign w:val="center"/>
+            <w:tcW w:w="1013" w:type="dxa"/>
           </w:tcPr>
           <w:p>
             <w:pPr>
               <w:pStyle w:val="TableHeading"/>
               <w:suppressLineNumbers/>
-              <w:shd w:fill="EEEEEE" w:val="clear"/>
               <w:bidi w:val="0"/>
               <w:spacing w:before="0" w:after="283"/>
               <w:jc w:val="left"/>
@@ -3778,15 +3614,14 @@
         </w:tc>
         <w:tc>
           <w:tcPr>
-            <w:tcW w:w="3599" w:type="dxa"/>
-            <w:tcBorders/>
-            <w:vAlign w:val="center"/>
+            <w:tcBorders/>
+            <w:vAlign w:val="center"/>
+            <w:tcW w:w="3916" w:type="dxa"/>
           </w:tcPr>
           <w:p>
             <w:pPr>
               <w:pStyle w:val="TableHeading"/>
               <w:suppressLineNumbers/>
-              <w:shd w:fill="EEEEEE" w:val="clear"/>
               <w:bidi w:val="0"/>
               <w:spacing w:before="0" w:after="283"/>
               <w:jc w:val="left"/>
@@ -3800,23 +3635,22 @@
         </w:tc>
         <w:tc>
           <w:tcPr>
-            <w:tcW w:w="7335" w:type="dxa"/>
-            <w:tcBorders/>
-            <w:vAlign w:val="center"/>
+            <w:tcBorders/>
+            <w:vAlign w:val="center"/>
+            <w:tcW w:w="4143" w:type="dxa"/>
           </w:tcPr>
           <w:p>
             <w:pPr>
               <w:pStyle w:val="TableHeading"/>
               <w:suppressLineNumbers/>
-              <w:shd w:fill="EEEEEE" w:val="clear"/>
-              <w:bidi w:val="0"/>
-              <w:spacing w:before="0" w:after="283"/>
-              <w:jc w:val="left"/>
-              <w:rPr/>
-            </w:pPr>
-            <w:r>
-              <w:rPr/>
-              <w:t>Where evidenced</w:t>
+              <w:bidi w:val="0"/>
+              <w:spacing w:before="0" w:after="283"/>
+              <w:jc w:val="left"/>
+              <w:rPr/>
+            </w:pPr>
+            <w:r>
+              <w:rPr/>
+              <w:t>Where it's covered</w:t>
             </w:r>
           </w:p>
         </w:tc>
@@ -3825,9 +3659,9 @@
         <w:trPr/>
         <w:tc>
           <w:tcPr>
-            <w:tcW w:w="405" w:type="dxa"/>
-            <w:tcBorders/>
-            <w:vAlign w:val="center"/>
+            <w:tcBorders/>
+            <w:vAlign w:val="center"/>
+            <w:tcW w:w="1013" w:type="dxa"/>
           </w:tcPr>
           <w:p>
             <w:pPr>
@@ -3845,9 +3679,9 @@
         </w:tc>
         <w:tc>
           <w:tcPr>
-            <w:tcW w:w="3599" w:type="dxa"/>
-            <w:tcBorders/>
-            <w:vAlign w:val="center"/>
+            <w:tcBorders/>
+            <w:vAlign w:val="center"/>
+            <w:tcW w:w="3916" w:type="dxa"/>
           </w:tcPr>
           <w:p>
             <w:pPr>
@@ -3865,21 +3699,21 @@
         </w:tc>
         <w:tc>
           <w:tcPr>
-            <w:tcW w:w="7335" w:type="dxa"/>
-            <w:tcBorders/>
-            <w:vAlign w:val="center"/>
-          </w:tcPr>
-          <w:p>
-            <w:pPr>
-              <w:pStyle w:val="TableContents"/>
-              <w:bidi w:val="0"/>
-              <w:spacing w:before="0" w:after="283"/>
-              <w:jc w:val="left"/>
-              <w:rPr/>
-            </w:pPr>
-            <w:r>
-              <w:rPr/>
-              <w:t>§1, incl. the O1–O5 table</w:t>
+            <w:tcBorders/>
+            <w:vAlign w:val="center"/>
+            <w:tcW w:w="4143" w:type="dxa"/>
+          </w:tcPr>
+          <w:p>
+            <w:pPr>
+              <w:pStyle w:val="TableContents"/>
+              <w:bidi w:val="0"/>
+              <w:spacing w:before="0" w:after="283"/>
+              <w:jc w:val="left"/>
+              <w:rPr/>
+            </w:pPr>
+            <w:r>
+              <w:rPr/>
+              <w:t>§1, incl. the O1 to O5 table</w:t>
             </w:r>
           </w:p>
         </w:tc>
@@ -3888,9 +3722,9 @@
         <w:trPr/>
         <w:tc>
           <w:tcPr>
-            <w:tcW w:w="405" w:type="dxa"/>
-            <w:tcBorders/>
-            <w:vAlign w:val="center"/>
+            <w:tcBorders/>
+            <w:vAlign w:val="center"/>
+            <w:tcW w:w="1013" w:type="dxa"/>
           </w:tcPr>
           <w:p>
             <w:pPr>
@@ -3908,9 +3742,9 @@
         </w:tc>
         <w:tc>
           <w:tcPr>
-            <w:tcW w:w="3599" w:type="dxa"/>
-            <w:tcBorders/>
-            <w:vAlign w:val="center"/>
+            <w:tcBorders/>
+            <w:vAlign w:val="center"/>
+            <w:tcW w:w="3916" w:type="dxa"/>
           </w:tcPr>
           <w:p>
             <w:pPr>
@@ -3928,9 +3762,9 @@
         </w:tc>
         <w:tc>
           <w:tcPr>
-            <w:tcW w:w="7335" w:type="dxa"/>
-            <w:tcBorders/>
-            <w:vAlign w:val="center"/>
+            <w:tcBorders/>
+            <w:vAlign w:val="center"/>
+            <w:tcW w:w="4143" w:type="dxa"/>
           </w:tcPr>
           <w:p>
             <w:pPr>
@@ -3951,9 +3785,9 @@
         <w:trPr/>
         <w:tc>
           <w:tcPr>
-            <w:tcW w:w="405" w:type="dxa"/>
-            <w:tcBorders/>
-            <w:vAlign w:val="center"/>
+            <w:tcBorders/>
+            <w:vAlign w:val="center"/>
+            <w:tcW w:w="1013" w:type="dxa"/>
           </w:tcPr>
           <w:p>
             <w:pPr>
@@ -3971,9 +3805,9 @@
         </w:tc>
         <w:tc>
           <w:tcPr>
-            <w:tcW w:w="3599" w:type="dxa"/>
-            <w:tcBorders/>
-            <w:vAlign w:val="center"/>
+            <w:tcBorders/>
+            <w:vAlign w:val="center"/>
+            <w:tcW w:w="3916" w:type="dxa"/>
           </w:tcPr>
           <w:p>
             <w:pPr>
@@ -3991,21 +3825,21 @@
         </w:tc>
         <w:tc>
           <w:tcPr>
-            <w:tcW w:w="7335" w:type="dxa"/>
-            <w:tcBorders/>
-            <w:vAlign w:val="center"/>
-          </w:tcPr>
-          <w:p>
-            <w:pPr>
-              <w:pStyle w:val="TableContents"/>
-              <w:bidi w:val="0"/>
-              <w:spacing w:before="0" w:after="283"/>
-              <w:jc w:val="left"/>
-              <w:rPr/>
-            </w:pPr>
-            <w:r>
-              <w:rPr/>
-              <w:t>§3, four alternatives, each rejected on a stated ground</w:t>
+            <w:tcBorders/>
+            <w:vAlign w:val="center"/>
+            <w:tcW w:w="4143" w:type="dxa"/>
+          </w:tcPr>
+          <w:p>
+            <w:pPr>
+              <w:pStyle w:val="TableContents"/>
+              <w:bidi w:val="0"/>
+              <w:spacing w:before="0" w:after="283"/>
+              <w:jc w:val="left"/>
+              <w:rPr/>
+            </w:pPr>
+            <w:r>
+              <w:rPr/>
+              <w:t>§3, four alternatives, each rejected on a stated reason</w:t>
             </w:r>
           </w:p>
         </w:tc>
@@ -4014,9 +3848,9 @@
         <w:trPr/>
         <w:tc>
           <w:tcPr>
-            <w:tcW w:w="405" w:type="dxa"/>
-            <w:tcBorders/>
-            <w:vAlign w:val="center"/>
+            <w:tcBorders/>
+            <w:vAlign w:val="center"/>
+            <w:tcW w:w="1013" w:type="dxa"/>
           </w:tcPr>
           <w:p>
             <w:pPr>
@@ -4034,9 +3868,9 @@
         </w:tc>
         <w:tc>
           <w:tcPr>
-            <w:tcW w:w="3599" w:type="dxa"/>
-            <w:tcBorders/>
-            <w:vAlign w:val="center"/>
+            <w:tcBorders/>
+            <w:vAlign w:val="center"/>
+            <w:tcW w:w="3916" w:type="dxa"/>
           </w:tcPr>
           <w:p>
             <w:pPr>
@@ -4054,9 +3888,9 @@
         </w:tc>
         <w:tc>
           <w:tcPr>
-            <w:tcW w:w="7335" w:type="dxa"/>
-            <w:tcBorders/>
-            <w:vAlign w:val="center"/>
+            <w:tcBorders/>
+            <w:vAlign w:val="center"/>
+            <w:tcW w:w="4143" w:type="dxa"/>
           </w:tcPr>
           <w:p>
             <w:pPr>
@@ -4087,9 +3921,9 @@
         <w:trPr/>
         <w:tc>
           <w:tcPr>
-            <w:tcW w:w="405" w:type="dxa"/>
-            <w:tcBorders/>
-            <w:vAlign w:val="center"/>
+            <w:tcBorders/>
+            <w:vAlign w:val="center"/>
+            <w:tcW w:w="1013" w:type="dxa"/>
           </w:tcPr>
           <w:p>
             <w:pPr>
@@ -4107,9 +3941,9 @@
         </w:tc>
         <w:tc>
           <w:tcPr>
-            <w:tcW w:w="3599" w:type="dxa"/>
-            <w:tcBorders/>
-            <w:vAlign w:val="center"/>
+            <w:tcBorders/>
+            <w:vAlign w:val="center"/>
+            <w:tcW w:w="3916" w:type="dxa"/>
           </w:tcPr>
           <w:p>
             <w:pPr>
@@ -4127,9 +3961,9 @@
         </w:tc>
         <w:tc>
           <w:tcPr>
-            <w:tcW w:w="7335" w:type="dxa"/>
-            <w:tcBorders/>
-            <w:vAlign w:val="center"/>
+            <w:tcBorders/>
+            <w:vAlign w:val="center"/>
+            <w:tcW w:w="4143" w:type="dxa"/>
           </w:tcPr>
           <w:p>
             <w:pPr>
@@ -4160,9 +3994,9 @@
         <w:trPr/>
         <w:tc>
           <w:tcPr>
-            <w:tcW w:w="405" w:type="dxa"/>
-            <w:tcBorders/>
-            <w:vAlign w:val="center"/>
+            <w:tcBorders/>
+            <w:vAlign w:val="center"/>
+            <w:tcW w:w="1013" w:type="dxa"/>
           </w:tcPr>
           <w:p>
             <w:pPr>
@@ -4180,9 +4014,9 @@
         </w:tc>
         <w:tc>
           <w:tcPr>
-            <w:tcW w:w="3599" w:type="dxa"/>
-            <w:tcBorders/>
-            <w:vAlign w:val="center"/>
+            <w:tcBorders/>
+            <w:vAlign w:val="center"/>
+            <w:tcW w:w="3916" w:type="dxa"/>
           </w:tcPr>
           <w:p>
             <w:pPr>
@@ -4200,21 +4034,21 @@
         </w:tc>
         <w:tc>
           <w:tcPr>
-            <w:tcW w:w="7335" w:type="dxa"/>
-            <w:tcBorders/>
-            <w:vAlign w:val="center"/>
-          </w:tcPr>
-          <w:p>
-            <w:pPr>
-              <w:pStyle w:val="TableContents"/>
-              <w:bidi w:val="0"/>
-              <w:spacing w:before="0" w:after="283"/>
-              <w:jc w:val="left"/>
-              <w:rPr/>
-            </w:pPr>
-            <w:r>
-              <w:rPr/>
-              <w:t>§6, incl. the honest account of expertise identified but not engaged</w:t>
+            <w:tcBorders/>
+            <w:vAlign w:val="center"/>
+            <w:tcW w:w="4143" w:type="dxa"/>
+          </w:tcPr>
+          <w:p>
+            <w:pPr>
+              <w:pStyle w:val="TableContents"/>
+              <w:bidi w:val="0"/>
+              <w:spacing w:before="0" w:after="283"/>
+              <w:jc w:val="left"/>
+              <w:rPr/>
+            </w:pPr>
+            <w:r>
+              <w:rPr/>
+              <w:t>§6, including the honest account of expertise identified but not brought in</w:t>
             </w:r>
           </w:p>
         </w:tc>
@@ -4223,9 +4057,9 @@
         <w:trPr/>
         <w:tc>
           <w:tcPr>
-            <w:tcW w:w="405" w:type="dxa"/>
-            <w:tcBorders/>
-            <w:vAlign w:val="center"/>
+            <w:tcBorders/>
+            <w:vAlign w:val="center"/>
+            <w:tcW w:w="1013" w:type="dxa"/>
           </w:tcPr>
           <w:p>
             <w:pPr>
@@ -4243,9 +4077,9 @@
         </w:tc>
         <w:tc>
           <w:tcPr>
-            <w:tcW w:w="3599" w:type="dxa"/>
-            <w:tcBorders/>
-            <w:vAlign w:val="center"/>
+            <w:tcBorders/>
+            <w:vAlign w:val="center"/>
+            <w:tcW w:w="3916" w:type="dxa"/>
           </w:tcPr>
           <w:p>
             <w:pPr>
@@ -4263,9 +4097,9 @@
         </w:tc>
         <w:tc>
           <w:tcPr>
-            <w:tcW w:w="7335" w:type="dxa"/>
-            <w:tcBorders/>
-            <w:vAlign w:val="center"/>
+            <w:tcBorders/>
+            <w:vAlign w:val="center"/>
+            <w:tcW w:w="4143" w:type="dxa"/>
           </w:tcPr>
           <w:p>
             <w:pPr>
@@ -4286,9 +4120,9 @@
         <w:trPr/>
         <w:tc>
           <w:tcPr>
-            <w:tcW w:w="405" w:type="dxa"/>
-            <w:tcBorders/>
-            <w:vAlign w:val="center"/>
+            <w:tcBorders/>
+            <w:vAlign w:val="center"/>
+            <w:tcW w:w="1013" w:type="dxa"/>
           </w:tcPr>
           <w:p>
             <w:pPr>
@@ -4306,9 +4140,9 @@
         </w:tc>
         <w:tc>
           <w:tcPr>
-            <w:tcW w:w="3599" w:type="dxa"/>
-            <w:tcBorders/>
-            <w:vAlign w:val="center"/>
+            <w:tcBorders/>
+            <w:vAlign w:val="center"/>
+            <w:tcW w:w="3916" w:type="dxa"/>
           </w:tcPr>
           <w:p>
             <w:pPr>
@@ -4326,21 +4160,21 @@
         </w:tc>
         <w:tc>
           <w:tcPr>
-            <w:tcW w:w="7335" w:type="dxa"/>
-            <w:tcBorders/>
-            <w:vAlign w:val="center"/>
-          </w:tcPr>
-          <w:p>
-            <w:pPr>
-              <w:pStyle w:val="TableContents"/>
-              <w:bidi w:val="0"/>
-              <w:spacing w:before="0" w:after="283"/>
-              <w:jc w:val="left"/>
-              <w:rPr/>
-            </w:pPr>
-            <w:r>
-              <w:rPr/>
-              <w:t>§13.1, §13.2, conclusions drawn from §10's validation results</w:t>
+            <w:tcBorders/>
+            <w:vAlign w:val="center"/>
+            <w:tcW w:w="4143" w:type="dxa"/>
+          </w:tcPr>
+          <w:p>
+            <w:pPr>
+              <w:pStyle w:val="TableContents"/>
+              <w:bidi w:val="0"/>
+              <w:spacing w:before="0" w:after="283"/>
+              <w:jc w:val="left"/>
+              <w:rPr/>
+            </w:pPr>
+            <w:r>
+              <w:rPr/>
+              <w:t>§13.1, §13.2, conclusions drawn straight from §10's validation results</w:t>
             </w:r>
           </w:p>
         </w:tc>
@@ -4349,9 +4183,9 @@
         <w:trPr/>
         <w:tc>
           <w:tcPr>
-            <w:tcW w:w="405" w:type="dxa"/>
-            <w:tcBorders/>
-            <w:vAlign w:val="center"/>
+            <w:tcBorders/>
+            <w:vAlign w:val="center"/>
+            <w:tcW w:w="1013" w:type="dxa"/>
           </w:tcPr>
           <w:p>
             <w:pPr>
@@ -4369,9 +4203,9 @@
         </w:tc>
         <w:tc>
           <w:tcPr>
-            <w:tcW w:w="3599" w:type="dxa"/>
-            <w:tcBorders/>
-            <w:vAlign w:val="center"/>
+            <w:tcBorders/>
+            <w:vAlign w:val="center"/>
+            <w:tcW w:w="3916" w:type="dxa"/>
           </w:tcPr>
           <w:p>
             <w:pPr>
@@ -4389,9 +4223,9 @@
         </w:tc>
         <w:tc>
           <w:tcPr>
-            <w:tcW w:w="7335" w:type="dxa"/>
-            <w:tcBorders/>
-            <w:vAlign w:val="center"/>
+            <w:tcBorders/>
+            <w:vAlign w:val="center"/>
+            <w:tcW w:w="4143" w:type="dxa"/>
           </w:tcPr>
           <w:p>
             <w:pPr>
@@ -4412,9 +4246,9 @@
         <w:trPr/>
         <w:tc>
           <w:tcPr>
-            <w:tcW w:w="405" w:type="dxa"/>
-            <w:tcBorders/>
-            <w:vAlign w:val="center"/>
+            <w:tcBorders/>
+            <w:vAlign w:val="center"/>
+            <w:tcW w:w="1013" w:type="dxa"/>
           </w:tcPr>
           <w:p>
             <w:pPr>
@@ -4432,9 +4266,9 @@
         </w:tc>
         <w:tc>
           <w:tcPr>
-            <w:tcW w:w="3599" w:type="dxa"/>
-            <w:tcBorders/>
-            <w:vAlign w:val="center"/>
+            <w:tcBorders/>
+            <w:vAlign w:val="center"/>
+            <w:tcW w:w="3916" w:type="dxa"/>
           </w:tcPr>
           <w:p>
             <w:pPr>
@@ -4452,9 +4286,9 @@
         </w:tc>
         <w:tc>
           <w:tcPr>
-            <w:tcW w:w="7335" w:type="dxa"/>
-            <w:tcBorders/>
-            <w:vAlign w:val="center"/>
+            <w:tcBorders/>
+            <w:vAlign w:val="center"/>
+            <w:tcW w:w="4143" w:type="dxa"/>
           </w:tcPr>
           <w:p>
             <w:pPr>
@@ -4475,9 +4309,9 @@
         <w:trPr/>
         <w:tc>
           <w:tcPr>
-            <w:tcW w:w="405" w:type="dxa"/>
-            <w:tcBorders/>
-            <w:vAlign w:val="center"/>
+            <w:tcBorders/>
+            <w:vAlign w:val="center"/>
+            <w:tcW w:w="1013" w:type="dxa"/>
           </w:tcPr>
           <w:p>
             <w:pPr>
@@ -4495,9 +4329,9 @@
         </w:tc>
         <w:tc>
           <w:tcPr>
-            <w:tcW w:w="3599" w:type="dxa"/>
-            <w:tcBorders/>
-            <w:vAlign w:val="center"/>
+            <w:tcBorders/>
+            <w:vAlign w:val="center"/>
+            <w:tcW w:w="3916" w:type="dxa"/>
           </w:tcPr>
           <w:p>
             <w:pPr>
@@ -4515,9 +4349,9 @@
         </w:tc>
         <w:tc>
           <w:tcPr>
-            <w:tcW w:w="7335" w:type="dxa"/>
-            <w:tcBorders/>
-            <w:vAlign w:val="center"/>
+            <w:tcBorders/>
+            <w:vAlign w:val="center"/>
+            <w:tcW w:w="4143" w:type="dxa"/>
           </w:tcPr>
           <w:p>
             <w:pPr>
@@ -4538,9 +4372,9 @@
         <w:trPr/>
         <w:tc>
           <w:tcPr>
-            <w:tcW w:w="405" w:type="dxa"/>
-            <w:tcBorders/>
-            <w:vAlign w:val="center"/>
+            <w:tcBorders/>
+            <w:vAlign w:val="center"/>
+            <w:tcW w:w="1013" w:type="dxa"/>
           </w:tcPr>
           <w:p>
             <w:pPr>
@@ -4558,9 +4392,9 @@
         </w:tc>
         <w:tc>
           <w:tcPr>
-            <w:tcW w:w="3599" w:type="dxa"/>
-            <w:tcBorders/>
-            <w:vAlign w:val="center"/>
+            <w:tcBorders/>
+            <w:vAlign w:val="center"/>
+            <w:tcW w:w="3916" w:type="dxa"/>
           </w:tcPr>
           <w:p>
             <w:pPr>
@@ -4578,9 +4412,9 @@
         </w:tc>
         <w:tc>
           <w:tcPr>
-            <w:tcW w:w="7335" w:type="dxa"/>
-            <w:tcBorders/>
-            <w:vAlign w:val="center"/>
+            <w:tcBorders/>
+            <w:vAlign w:val="center"/>
+            <w:tcW w:w="4143" w:type="dxa"/>
           </w:tcPr>
           <w:p>
             <w:pPr>
@@ -4607,9 +4441,9 @@
         <w:trPr/>
         <w:tc>
           <w:tcPr>
-            <w:tcW w:w="405" w:type="dxa"/>
-            <w:tcBorders/>
-            <w:vAlign w:val="center"/>
+            <w:tcBorders/>
+            <w:vAlign w:val="center"/>
+            <w:tcW w:w="1013" w:type="dxa"/>
           </w:tcPr>
           <w:p>
             <w:pPr>
@@ -4627,9 +4461,9 @@
         </w:tc>
         <w:tc>
           <w:tcPr>
-            <w:tcW w:w="3599" w:type="dxa"/>
-            <w:tcBorders/>
-            <w:vAlign w:val="center"/>
+            <w:tcBorders/>
+            <w:vAlign w:val="center"/>
+            <w:tcW w:w="3916" w:type="dxa"/>
           </w:tcPr>
           <w:p>
             <w:pPr>
@@ -4647,9 +4481,9 @@
         </w:tc>
         <w:tc>
           <w:tcPr>
-            <w:tcW w:w="7335" w:type="dxa"/>
-            <w:tcBorders/>
-            <w:vAlign w:val="center"/>
+            <w:tcBorders/>
+            <w:vAlign w:val="center"/>
+            <w:tcW w:w="4143" w:type="dxa"/>
           </w:tcPr>
           <w:p>
             <w:pPr>
@@ -4670,9 +4504,9 @@
         <w:trPr/>
         <w:tc>
           <w:tcPr>
-            <w:tcW w:w="405" w:type="dxa"/>
-            <w:tcBorders/>
-            <w:vAlign w:val="center"/>
+            <w:tcBorders/>
+            <w:vAlign w:val="center"/>
+            <w:tcW w:w="1013" w:type="dxa"/>
           </w:tcPr>
           <w:p>
             <w:pPr>
@@ -4690,9 +4524,9 @@
         </w:tc>
         <w:tc>
           <w:tcPr>
-            <w:tcW w:w="3599" w:type="dxa"/>
-            <w:tcBorders/>
-            <w:vAlign w:val="center"/>
+            <w:tcBorders/>
+            <w:vAlign w:val="center"/>
+            <w:tcW w:w="3916" w:type="dxa"/>
           </w:tcPr>
           <w:p>
             <w:pPr>
@@ -4710,9 +4544,9 @@
         </w:tc>
         <w:tc>
           <w:tcPr>
-            <w:tcW w:w="7335" w:type="dxa"/>
-            <w:tcBorders/>
-            <w:vAlign w:val="center"/>
+            <w:tcBorders/>
+            <w:vAlign w:val="center"/>
+            <w:tcW w:w="4143" w:type="dxa"/>
           </w:tcPr>
           <w:p>
             <w:pPr>
@@ -4733,9 +4567,9 @@
         <w:trPr/>
         <w:tc>
           <w:tcPr>
-            <w:tcW w:w="405" w:type="dxa"/>
-            <w:tcBorders/>
-            <w:vAlign w:val="center"/>
+            <w:tcBorders/>
+            <w:vAlign w:val="center"/>
+            <w:tcW w:w="1013" w:type="dxa"/>
           </w:tcPr>
           <w:p>
             <w:pPr>
@@ -4753,9 +4587,9 @@
         </w:tc>
         <w:tc>
           <w:tcPr>
-            <w:tcW w:w="3599" w:type="dxa"/>
-            <w:tcBorders/>
-            <w:vAlign w:val="center"/>
+            <w:tcBorders/>
+            <w:vAlign w:val="center"/>
+            <w:tcW w:w="3916" w:type="dxa"/>
           </w:tcPr>
           <w:p>
             <w:pPr>
@@ -4773,9 +4607,9 @@
         </w:tc>
         <w:tc>
           <w:tcPr>
-            <w:tcW w:w="7335" w:type="dxa"/>
-            <w:tcBorders/>
-            <w:vAlign w:val="center"/>
+            <w:tcBorders/>
+            <w:vAlign w:val="center"/>
+            <w:tcW w:w="4143" w:type="dxa"/>
           </w:tcPr>
           <w:p>
             <w:pPr>
@@ -4793,17 +4627,6 @@
         </w:tc>
       </w:tr>
     </w:tbl>
-    <w:p>
-      <w:pPr>
-        <w:pStyle w:val="HorizontalLine"/>
-        <w:bidi w:val="0"/>
-        <w:jc w:val="left"/>
-        <w:rPr/>
-      </w:pPr>
-      <w:r>
-        <w:rPr/>
-      </w:r>
-    </w:p>
     <w:p>
       <w:pPr>
         <w:pStyle w:val="Heading2"/>
@@ -4887,11 +4710,11 @@
       <w:footerReference w:type="default" r:id="rId6"/>
       <w:type w:val="nextPage"/>
       <w:pgSz w:w="11906" w:h="16838"/>
-      <w:pgMar w:left="1247" w:right="1247" w:gutter="0" w:header="0" w:top="1247" w:footer="0" w:bottom="1247"/>
+      <w:pgMar w:left="1417" w:right="1417" w:gutter="0" w:header="0" w:top="1417" w:footer="0" w:bottom="1417"/>
       <w:pgNumType w:fmt="decimal"/>
       <w:formProt w:val="false"/>
       <w:textDirection w:val="lrTb"/>
-      <w:docGrid w:type="default" w:linePitch="600" w:charSpace="36864"/>
+      <w:docGrid w:type="default" w:linePitch="600" w:charSpace="32768"/>
     </w:sectPr>
   </w:body>
 </w:document>
@@ -5575,10 +5398,10 @@
       <w:spacing w:lineRule="auto" w:line="336"/>
     </w:pPr>
     <w:rPr>
-      <w:rFonts w:ascii="Calibri;Helvetica;sans-serif" w:hAnsi="Calibri;Helvetica;sans-serif" w:eastAsia="Calibri;Helvetica;sans-serif" w:cs="Calibri;Helvetica;sans-serif"/>
-      <w:color w:val="111111"/>
-      <w:sz w:val="22"/>
-      <w:szCs w:val="22"/>
+      <w:rFonts w:ascii="Times New Roman;Times;serif" w:hAnsi="Times New Roman;Times;serif" w:eastAsia="Times New Roman;Times;serif" w:cs="Times New Roman;Times;serif"/>
+      <w:color w:val="000000"/>
+      <w:sz w:val="24"/>
+      <w:szCs w:val="24"/>
       <w:lang w:val="en-US" w:eastAsia="zh-CN" w:bidi="hi-IN"/>
     </w:rPr>
   </w:style>
@@ -5587,12 +5410,14 @@
     <w:basedOn w:val="Heading"/>
     <w:next w:val="BodyText"/>
     <w:qFormat/>
-    <w:pPr/>
+    <w:pPr>
+      <w:spacing w:lineRule="auto" w:line="300" w:before="240" w:after="280"/>
+    </w:pPr>
     <w:rPr>
       <w:b/>
       <w:bCs/>
-      <w:sz w:val="36"/>
-      <w:szCs w:val="36"/>
+      <w:sz w:val="32"/>
+      <w:szCs w:val="32"/>
     </w:rPr>
   </w:style>
   <w:style w:type="paragraph" w:styleId="Heading2">
@@ -5601,18 +5426,15 @@
     <w:next w:val="BodyText"/>
     <w:qFormat/>
     <w:pPr>
-      <w:pBdr>
-        <w:bottom w:val="single" w:sz="2" w:space="3" w:color="999999"/>
-      </w:pBdr>
-      <w:spacing w:before="440" w:after="120"/>
+      <w:spacing w:before="440" w:after="160"/>
       <w:outlineLvl w:val="1"/>
     </w:pPr>
     <w:rPr>
       <w:rFonts w:ascii="Liberation Serif" w:hAnsi="Liberation Serif" w:eastAsia="Songti SC" w:cs="Arial Unicode MS"/>
       <w:b/>
       <w:bCs/>
-      <w:sz w:val="28"/>
-      <w:szCs w:val="28"/>
+      <w:sz w:val="26"/>
+      <w:szCs w:val="26"/>
     </w:rPr>
   </w:style>
   <w:style w:type="paragraph" w:styleId="Heading3">
@@ -5621,13 +5443,15 @@
     <w:next w:val="BodyText"/>
     <w:qFormat/>
     <w:pPr>
-      <w:spacing w:before="320" w:after="120"/>
+      <w:spacing w:before="280" w:after="120"/>
       <w:outlineLvl w:val="2"/>
     </w:pPr>
     <w:rPr>
       <w:rFonts w:ascii="Liberation Serif" w:hAnsi="Liberation Serif" w:eastAsia="Songti SC" w:cs="Arial Unicode MS"/>
       <w:b/>
       <w:bCs/>
+      <w:i/>
+      <w:iCs/>
       <w:sz w:val="24"/>
       <w:szCs w:val="24"/>
     </w:rPr>
@@ -5665,8 +5489,9 @@
     <w:name w:val="Source Text"/>
     <w:qFormat/>
     <w:rPr>
-      <w:rFonts w:ascii="monospace" w:hAnsi="monospace" w:eastAsia="monospace" w:cs="monospace"/>
-      <w:shd w:fill="F2F2F2" w:val="clear"/>
+      <w:rFonts w:ascii="Courier New;Courier;monospace" w:hAnsi="Courier New;Courier;monospace" w:eastAsia="Courier New;Courier;monospace" w:cs="Courier New;Courier;monospace"/>
+      <w:sz w:val="21"/>
+      <w:szCs w:val="21"/>
     </w:rPr>
   </w:style>
   <w:style w:type="character" w:styleId="Strong">
@@ -5792,14 +5617,18 @@
     <w:basedOn w:val="Normal"/>
     <w:qFormat/>
     <w:pPr>
-      <w:pBdr/>
-      <w:shd w:fill="F2F2F2" w:val="clear"/>
+      <w:pBdr>
+        <w:top w:val="single" w:sz="2" w:space="6" w:color="999999"/>
+        <w:left w:val="single" w:sz="2" w:space="6" w:color="999999"/>
+        <w:bottom w:val="single" w:sz="2" w:space="6" w:color="999999"/>
+        <w:right w:val="single" w:sz="2" w:space="6" w:color="999999"/>
+      </w:pBdr>
       <w:spacing w:before="0" w:after="0"/>
     </w:pPr>
     <w:rPr>
-      <w:rFonts w:ascii="Liberation Mono" w:hAnsi="Liberation Mono" w:eastAsia="Liberation Mono" w:cs="Liberation Mono"/>
-      <w:sz w:val="18"/>
-      <w:szCs w:val="18"/>
+      <w:rFonts w:ascii="Courier New;Courier;monospace" w:hAnsi="Courier New;Courier;monospace" w:eastAsia="Courier New;Courier;monospace" w:cs="Courier New;Courier;monospace"/>
+      <w:sz w:val="17"/>
+      <w:szCs w:val="17"/>
     </w:rPr>
   </w:style>
   <w:style w:type="paragraph" w:styleId="BlockQuotation">
@@ -5808,13 +5637,14 @@
     <w:qFormat/>
     <w:pPr>
       <w:pBdr>
-        <w:left w:val="single" w:sz="18" w:space="10" w:color="999999"/>
+        <w:left w:val="single" w:sz="12" w:space="10" w:color="777777"/>
       </w:pBdr>
       <w:spacing w:before="160" w:after="160"/>
       <w:ind w:hanging="0" w:left="160" w:right="160"/>
     </w:pPr>
     <w:rPr>
-      <w:color w:val="444444"/>
+      <w:i/>
+      <w:iCs/>
     </w:rPr>
   </w:style>
   <w:style w:type="paragraph" w:styleId="TableHeading">
@@ -5823,7 +5653,6 @@
     <w:qFormat/>
     <w:pPr>
       <w:suppressLineNumbers/>
-      <w:shd w:fill="EEEEEE" w:val="clear"/>
       <w:jc w:val="left"/>
     </w:pPr>
     <w:rPr>

</xml_diff>